<commit_message>
Poster: Results, Discussion, Conclusion, and Limitations together; Public Health Implications and Future Work together (as in the Liberty sample)
Co-Authored-By: Claude Opus 5.5 <noreply@anthropic.com>
Claude-Session: https://claude.ai/code/session_01N468nYR7vy45HpujgUezn5
</commit_message>
<xml_diff>
--- a/poster/Poster_Full_Reference_List.docx
+++ b/poster/Poster_Full_Reference_List.docx
@@ -628,16 +628,341 @@
     </w:p>
     <w:p>
       <w:pPr>
+        <w:pStyle w:val="Heading2"/>
+      </w:pPr>
+      <w:r>
+        <w:t>B. All 35 studies included in the scoping review</w:t>
+      </w:r>
+    </w:p>
+    <w:p>
+      <w:r>
+        <w:t>Listed alphabetically by first author. Studies also cited on the poster show their poster reference number in brackets.</w:t>
+      </w:r>
+    </w:p>
+    <w:p>
+      <w:pPr>
         <w:spacing w:after="80"/>
       </w:pPr>
       <w:r>
-        <w:t xml:space="preserve">24. </w:t>
+        <w:t xml:space="preserve">• </w:t>
       </w:r>
       <w:r>
         <w:rPr>
           <w:i w:val="0"/>
         </w:rPr>
-        <w:t xml:space="preserve">Heller-Boersma JG, Schmidt UH, Edmonds DK. A randomized controlled trial of a cognitive-behavioural group intervention versus waiting-list control for women with uterovaginal agenesis (Mayer-Rokitansky-Küster-Hauser syndrome: MRKH). </w:t>
+        <w:t xml:space="preserve">Arsy GR, Ratnawati R, Rachmawati SD. Low self-esteem of women suffering Mayer Rokitansky Kuster Hauser syndrome. </w:t>
+      </w:r>
+      <w:r>
+        <w:rPr>
+          <w:i/>
+        </w:rPr>
+        <w:t>Indian J Public Health Res Dev</w:t>
+      </w:r>
+      <w:r>
+        <w:rPr>
+          <w:i w:val="0"/>
+        </w:rPr>
+        <w:t>. 2019;10(8):2042-2045. doi:10.5958/0976-5506.2019.02155.7</w:t>
+      </w:r>
+    </w:p>
+    <w:p>
+      <w:pPr>
+        <w:spacing w:after="80"/>
+      </w:pPr>
+      <w:r>
+        <w:t xml:space="preserve">• </w:t>
+      </w:r>
+      <w:r>
+        <w:rPr>
+          <w:i w:val="0"/>
+        </w:rPr>
+        <w:t xml:space="preserve">Beisert MJ, Chodecka AM, Walczyk-Matyja K, Szymańska-Pytlińska ME, Kędzia W, Kapczuk K. Psychological correlates of sexual self-esteem in young women with Mayer-Rokitansky-Küster-Hauser syndrome. </w:t>
+      </w:r>
+      <w:r>
+        <w:rPr>
+          <w:i/>
+        </w:rPr>
+        <w:t>Curr Issues Personal Psychol</w:t>
+      </w:r>
+      <w:r>
+        <w:rPr>
+          <w:i w:val="0"/>
+        </w:rPr>
+        <w:t>. 2022;10(4):333-342. doi:10.5114/cipp.2022.114044 [poster ref 11]</w:t>
+      </w:r>
+    </w:p>
+    <w:p>
+      <w:pPr>
+        <w:spacing w:after="80"/>
+      </w:pPr>
+      <w:r>
+        <w:t xml:space="preserve">• </w:t>
+      </w:r>
+      <w:r>
+        <w:rPr>
+          <w:i w:val="0"/>
+        </w:rPr>
+        <w:t xml:space="preserve">Carroll S, Laufer MR, Thomas-Kowal P, Lossie AC, Moss-Morris R. From engulfment to enrichment: associations between illness representations, self-concept, and psychological adjustment in Mayer-Rokitansky-Küster-Hauser syndrome. </w:t>
+      </w:r>
+      <w:r>
+        <w:rPr>
+          <w:i/>
+        </w:rPr>
+        <w:t>J Pediatr Adolesc Gynecol</w:t>
+      </w:r>
+      <w:r>
+        <w:rPr>
+          <w:i w:val="0"/>
+        </w:rPr>
+        <w:t>. 2020;33(6):639-648. doi:10.1016/j.jpag.2020.07.006 [poster ref 15]</w:t>
+      </w:r>
+    </w:p>
+    <w:p>
+      <w:pPr>
+        <w:spacing w:after="80"/>
+      </w:pPr>
+      <w:r>
+        <w:t xml:space="preserve">• </w:t>
+      </w:r>
+      <w:r>
+        <w:rPr>
+          <w:i w:val="0"/>
+        </w:rPr>
+        <w:t xml:space="preserve">Chen N, Song S, Duan Y, et al. Study on depressive symptoms in patients with Mayer-Rokitansky-Küster-Hauser syndrome: an analysis of 141 cases. </w:t>
+      </w:r>
+      <w:r>
+        <w:rPr>
+          <w:i/>
+        </w:rPr>
+        <w:t>Orphanet J Rare Dis</w:t>
+      </w:r>
+      <w:r>
+        <w:rPr>
+          <w:i w:val="0"/>
+        </w:rPr>
+        <w:t>. 2020;15(1):121. doi:10.1186/s13023-020-01405-9 [poster ref 16]</w:t>
+      </w:r>
+    </w:p>
+    <w:p>
+      <w:pPr>
+        <w:spacing w:after="80"/>
+      </w:pPr>
+      <w:r>
+        <w:t xml:space="preserve">• </w:t>
+      </w:r>
+      <w:r>
+        <w:rPr>
+          <w:i w:val="0"/>
+        </w:rPr>
+        <w:t xml:space="preserve">Di Mattei VE, Taranto P, Perego G, et al. Illness experience and (unmet) needs of women with Mayer-Rokitansky-Küster-Hauser syndrome (MRKH): a qualitative analysis of an online forum. </w:t>
+      </w:r>
+      <w:r>
+        <w:rPr>
+          <w:i/>
+        </w:rPr>
+        <w:t>Psychol Health</w:t>
+      </w:r>
+      <w:r>
+        <w:rPr>
+          <w:i w:val="0"/>
+        </w:rPr>
+        <w:t>. 2026;41(1):53-75. doi:10.1080/08870446.2024.2390647</w:t>
+      </w:r>
+    </w:p>
+    <w:p>
+      <w:pPr>
+        <w:spacing w:after="80"/>
+      </w:pPr>
+      <w:r>
+        <w:t xml:space="preserve">• </w:t>
+      </w:r>
+      <w:r>
+        <w:rPr>
+          <w:i w:val="0"/>
+        </w:rPr>
+        <w:t xml:space="preserve">Gilfillan R, Carter P. Issues of identity, perceptions and isolation: an interpretative phenomenological analysis of women's experience of Mayer-Rokitansky-Küster-Hauser (MRKH) syndrome. </w:t>
+      </w:r>
+      <w:r>
+        <w:rPr>
+          <w:i/>
+        </w:rPr>
+        <w:t>J Health Psychol</w:t>
+      </w:r>
+      <w:r>
+        <w:rPr>
+          <w:i w:val="0"/>
+        </w:rPr>
+        <w:t>. 2024;29(3):200-212. doi:10.1177/13591053231199253</w:t>
+      </w:r>
+    </w:p>
+    <w:p>
+      <w:pPr>
+        <w:spacing w:after="80"/>
+      </w:pPr>
+      <w:r>
+        <w:t xml:space="preserve">• </w:t>
+      </w:r>
+      <w:r>
+        <w:rPr>
+          <w:i w:val="0"/>
+        </w:rPr>
+        <w:t xml:space="preserve">Güner P, Ulukaya T, Pehlivan Sarıbudak T. "I felt like a woman": a phenomenological qualitative study of disease-related experiences in Mayer-Rokitansky-Küster-Hauser syndrome (MRKH syndrome). </w:t>
+      </w:r>
+      <w:r>
+        <w:rPr>
+          <w:i/>
+        </w:rPr>
+        <w:t>J Health Psychol</w:t>
+      </w:r>
+      <w:r>
+        <w:rPr>
+          <w:i w:val="0"/>
+        </w:rPr>
+        <w:t>. 2025;30(11):3137-3152. doi:10.1177/13591053241305941 [poster ref 12]</w:t>
+      </w:r>
+    </w:p>
+    <w:p>
+      <w:pPr>
+        <w:spacing w:after="80"/>
+      </w:pPr>
+      <w:r>
+        <w:t xml:space="preserve">• </w:t>
+      </w:r>
+      <w:r>
+        <w:rPr>
+          <w:i w:val="0"/>
+        </w:rPr>
+        <w:t xml:space="preserve">Güner P, Ulukaya T. From avoidance to empowerment: coping strategies in women with Müllerian agenesis (MRKH) after McIndoe reconstruction: a descriptive phenomenological study. </w:t>
+      </w:r>
+      <w:r>
+        <w:rPr>
+          <w:i/>
+        </w:rPr>
+        <w:t>J Pediatr Adolesc Gynecol</w:t>
+      </w:r>
+      <w:r>
+        <w:rPr>
+          <w:i w:val="0"/>
+        </w:rPr>
+        <w:t>. 2026;39(1):101-108. doi:10.1016/j.jpag.2025.10.013 [poster ref 19]</w:t>
+      </w:r>
+    </w:p>
+    <w:p>
+      <w:pPr>
+        <w:spacing w:after="80"/>
+      </w:pPr>
+      <w:r>
+        <w:t xml:space="preserve">• </w:t>
+      </w:r>
+      <w:r>
+        <w:rPr>
+          <w:i w:val="0"/>
+        </w:rPr>
+        <w:t xml:space="preserve">Hatim H, Zainuddin AA, Anizah A, et al. The missing uterus, the missed diagnosis, and the missing care. Mayer-Rokitansky-Küster-Hauser syndrome in the lives of women in Malaysia. </w:t>
+      </w:r>
+      <w:r>
+        <w:rPr>
+          <w:i/>
+        </w:rPr>
+        <w:t>J Pediatr Adolesc Gynecol</w:t>
+      </w:r>
+      <w:r>
+        <w:rPr>
+          <w:i w:val="0"/>
+        </w:rPr>
+        <w:t>. 2021;34(2):161-167. doi:10.1016/j.jpag.2020.11.009 [poster ref 23]</w:t>
+      </w:r>
+    </w:p>
+    <w:p>
+      <w:pPr>
+        <w:spacing w:after="80"/>
+      </w:pPr>
+      <w:r>
+        <w:t xml:space="preserve">• </w:t>
+      </w:r>
+      <w:r>
+        <w:rPr>
+          <w:i w:val="0"/>
+        </w:rPr>
+        <w:t xml:space="preserve">Jensen AH, Herlin MK, Trolle B, Vogel I, Lou S. Experiences of vaginal lengthening treatment and sexual well-being in women with Mayer-Rokitansky-Küster-Hauser (MRKH) syndrome: an interview study. </w:t>
+      </w:r>
+      <w:r>
+        <w:rPr>
+          <w:i/>
+        </w:rPr>
+        <w:t>BJOG</w:t>
+      </w:r>
+      <w:r>
+        <w:rPr>
+          <w:i w:val="0"/>
+        </w:rPr>
+        <w:t>. 2024;131(13):1841-1850. doi:10.1111/1471-0528.17916</w:t>
+      </w:r>
+    </w:p>
+    <w:p>
+      <w:pPr>
+        <w:spacing w:after="80"/>
+      </w:pPr>
+      <w:r>
+        <w:t xml:space="preserve">• </w:t>
+      </w:r>
+      <w:r>
+        <w:rPr>
+          <w:i w:val="0"/>
+        </w:rPr>
+        <w:t xml:space="preserve">Jensen AH, Herlin MK, Vogel I, Lou S. A life course perspective on Mayer-Rokitansky-Küster-Hauser syndrome: women's experiences and negotiations of living with an underdeveloped uterus and vagina. </w:t>
+      </w:r>
+      <w:r>
+        <w:rPr>
+          <w:i/>
+        </w:rPr>
+        <w:t>Disabil Rehabil</w:t>
+      </w:r>
+      <w:r>
+        <w:rPr>
+          <w:i w:val="0"/>
+        </w:rPr>
+        <w:t>. 2024;46(6):1130-1140. doi:10.1080/09638288.2023.2191014</w:t>
+      </w:r>
+    </w:p>
+    <w:p>
+      <w:pPr>
+        <w:spacing w:after="80"/>
+      </w:pPr>
+      <w:r>
+        <w:t xml:space="preserve">• </w:t>
+      </w:r>
+      <w:r>
+        <w:rPr>
+          <w:i w:val="0"/>
+        </w:rPr>
+        <w:t xml:space="preserve">Jha S, Singh S. Sexual and psychosocial outcome after neovaginoplasty using Interceed in females with Mayer-Rokitansky-Küster-Hauser syndrome: a case-control study. </w:t>
+      </w:r>
+      <w:r>
+        <w:rPr>
+          <w:i/>
+        </w:rPr>
+        <w:t>J Obstet Gynaecol Can</w:t>
+      </w:r>
+      <w:r>
+        <w:rPr>
+          <w:i w:val="0"/>
+        </w:rPr>
+        <w:t>. 2022;44(8):926-930. doi:10.1016/j.jogc.2022.03.018</w:t>
+      </w:r>
+    </w:p>
+    <w:p>
+      <w:pPr>
+        <w:spacing w:after="80"/>
+      </w:pPr>
+      <w:r>
+        <w:t xml:space="preserve">• </w:t>
+      </w:r>
+      <w:r>
+        <w:rPr>
+          <w:i w:val="0"/>
+        </w:rPr>
+        <w:t xml:space="preserve">Järvholm S, Enskog A, Hammarling C, Dahm-Kähler P, Brännström M. Uterus transplantation: joys and frustrations of becoming a "complete" woman—a qualitative study regarding self-image in the 5-year period after transplantation. </w:t>
       </w:r>
       <w:r>
         <w:rPr>
@@ -649,7 +974,579 @@
         <w:rPr>
           <w:i w:val="0"/>
         </w:rPr>
-        <w:t>. 2007;22(8):2296-2301. doi:10.1093/humrep/dem167</w:t>
+        <w:t>. 2020;35(8):1855-1863. doi:10.1093/humrep/deaa143</w:t>
+      </w:r>
+    </w:p>
+    <w:p>
+      <w:pPr>
+        <w:spacing w:after="80"/>
+      </w:pPr>
+      <w:r>
+        <w:t xml:space="preserve">• </w:t>
+      </w:r>
+      <w:r>
+        <w:rPr>
+          <w:i w:val="0"/>
+        </w:rPr>
+        <w:t xml:space="preserve">Kang J, Chen N, Song S, et al. Sexual function and quality of life after the creation of a neovagina in women with Mayer-Rokitansky-Küster-Hauser syndrome: comparison of vaginal dilation and surgical procedures. </w:t>
+      </w:r>
+      <w:r>
+        <w:rPr>
+          <w:i/>
+        </w:rPr>
+        <w:t>Fertil Steril</w:t>
+      </w:r>
+      <w:r>
+        <w:rPr>
+          <w:i w:val="0"/>
+        </w:rPr>
+        <w:t>. 2020;113(5):1024-1031. doi:10.1016/j.fertnstert.2020.01.017</w:t>
+      </w:r>
+    </w:p>
+    <w:p>
+      <w:pPr>
+        <w:spacing w:after="80"/>
+      </w:pPr>
+      <w:r>
+        <w:t xml:space="preserve">• </w:t>
+      </w:r>
+      <w:r>
+        <w:rPr>
+          <w:i w:val="0"/>
+        </w:rPr>
+        <w:t xml:space="preserve">Karpel L, Nicaise M, Carbonnel M, et al. Psychological evaluation of candidates for the uterus transplantation French trial. </w:t>
+      </w:r>
+      <w:r>
+        <w:rPr>
+          <w:i/>
+        </w:rPr>
+        <w:t>Acta Obstet Gynecol Scand</w:t>
+      </w:r>
+      <w:r>
+        <w:rPr>
+          <w:i w:val="0"/>
+        </w:rPr>
+        <w:t>. 2025;104(3):522-527. doi:10.1111/aogs.15004 [poster ref 18]</w:t>
+      </w:r>
+    </w:p>
+    <w:p>
+      <w:pPr>
+        <w:spacing w:after="80"/>
+      </w:pPr>
+      <w:r>
+        <w:t xml:space="preserve">• </w:t>
+      </w:r>
+      <w:r>
+        <w:rPr>
+          <w:i w:val="0"/>
+        </w:rPr>
+        <w:t xml:space="preserve">Khairudin KB, Nik Mhd Nor NS, Childs JF, et al. Prevalence of anxiety and depression in women with Mayer-Rokitansky-Küster-Hauser (MRKH) syndrome in Malaysia. </w:t>
+      </w:r>
+      <w:r>
+        <w:rPr>
+          <w:i/>
+        </w:rPr>
+        <w:t>J Pediatr Adolesc Gynecol</w:t>
+      </w:r>
+      <w:r>
+        <w:rPr>
+          <w:i w:val="0"/>
+        </w:rPr>
+        <w:t>. 2026;39(2):215-220. doi:10.1016/j.jpag.2025.11.005 [poster ref 17]</w:t>
+      </w:r>
+    </w:p>
+    <w:p>
+      <w:pPr>
+        <w:spacing w:after="80"/>
+      </w:pPr>
+      <w:r>
+        <w:t xml:space="preserve">• </w:t>
+      </w:r>
+      <w:r>
+        <w:rPr>
+          <w:i w:val="0"/>
+        </w:rPr>
+        <w:t xml:space="preserve">Le TTQ, Le NTH, Vu TA, Nguyen HH, Vuong LN. Perception of having children through surrogacy in individuals with MRKH in Vietnam: a qualitative study. </w:t>
+      </w:r>
+      <w:r>
+        <w:rPr>
+          <w:i/>
+        </w:rPr>
+        <w:t>Front Psychol</w:t>
+      </w:r>
+      <w:r>
+        <w:rPr>
+          <w:i w:val="0"/>
+        </w:rPr>
+        <w:t>. 2024;15:1372405. doi:10.3389/fpsyg.2024.1372405</w:t>
+      </w:r>
+    </w:p>
+    <w:p>
+      <w:pPr>
+        <w:spacing w:after="80"/>
+      </w:pPr>
+      <w:r>
+        <w:t xml:space="preserve">• </w:t>
+      </w:r>
+      <w:r>
+        <w:rPr>
+          <w:i w:val="0"/>
+        </w:rPr>
+        <w:t xml:space="preserve">Lei XH, Wang X, Shao SY, Hua KQ, Zhang Y. Self-esteem, depression, anxiety and sexual function in Mayer-Rokitansky-Küster-Hauser syndrome with neovagina: a case series. </w:t>
+      </w:r>
+      <w:r>
+        <w:rPr>
+          <w:i/>
+        </w:rPr>
+        <w:t>Eur J Obstet Gynecol Reprod Biol</w:t>
+      </w:r>
+      <w:r>
+        <w:rPr>
+          <w:i w:val="0"/>
+        </w:rPr>
+        <w:t>. 2024;298:85-90. doi:10.1016/j.ejogrb.2024.04.027</w:t>
+      </w:r>
+    </w:p>
+    <w:p>
+      <w:pPr>
+        <w:spacing w:after="80"/>
+      </w:pPr>
+      <w:r>
+        <w:t xml:space="preserve">• </w:t>
+      </w:r>
+      <w:r>
+        <w:rPr>
+          <w:i w:val="0"/>
+        </w:rPr>
+        <w:t xml:space="preserve">Lou S, Jensen AH, Vogel I, Trolle B, Herlin MK. Understanding the diagnostic odyssey of women with Mayer-Rokitansky-Küster-Hauser (MRKH) syndrome in Denmark: a qualitative interview study. </w:t>
+      </w:r>
+      <w:r>
+        <w:rPr>
+          <w:i/>
+        </w:rPr>
+        <w:t>J Pediatr Adolesc Gynecol</w:t>
+      </w:r>
+      <w:r>
+        <w:rPr>
+          <w:i w:val="0"/>
+        </w:rPr>
+        <w:t>. 2024;37(4):412-418. doi:10.1016/j.jpag.2024.03.003 [poster ref 13]</w:t>
+      </w:r>
+    </w:p>
+    <w:p>
+      <w:pPr>
+        <w:spacing w:after="80"/>
+      </w:pPr>
+      <w:r>
+        <w:t xml:space="preserve">• </w:t>
+      </w:r>
+      <w:r>
+        <w:rPr>
+          <w:i w:val="0"/>
+        </w:rPr>
+        <w:t xml:space="preserve">Mao M, Zhang Y, Fu H, Wang Q, Bai J, Guo R. Long-term results of sexual function and body image after vaginoplasty with acellular dermal matrix in women with Mayer-Rokitansky-Küster-Hauser syndrome. </w:t>
+      </w:r>
+      <w:r>
+        <w:rPr>
+          <w:i/>
+        </w:rPr>
+        <w:t>J Minim Invasive Gynecol</w:t>
+      </w:r>
+      <w:r>
+        <w:rPr>
+          <w:i w:val="0"/>
+        </w:rPr>
+        <w:t>. 2024;31(1):37-42. doi:10.1016/j.jmig.2023.10.003</w:t>
+      </w:r>
+    </w:p>
+    <w:p>
+      <w:pPr>
+        <w:spacing w:after="80"/>
+      </w:pPr>
+      <w:r>
+        <w:t xml:space="preserve">• </w:t>
+      </w:r>
+      <w:r>
+        <w:rPr>
+          <w:i w:val="0"/>
+        </w:rPr>
+        <w:t xml:space="preserve">Marshall N, Rajesh Z, Hunker K, et al. "Don't give up, advocate for yourself": a pilot study examining healthcare experiences of people with Mayer Rokitansky Küster Hauser syndrome. </w:t>
+      </w:r>
+      <w:r>
+        <w:rPr>
+          <w:i/>
+        </w:rPr>
+        <w:t>J Pediatr Adolesc Gynecol</w:t>
+      </w:r>
+      <w:r>
+        <w:rPr>
+          <w:i w:val="0"/>
+        </w:rPr>
+        <w:t>. 2025;38(2):167-173. doi:10.1016/j.jpag.2024.12.001 [poster ref 22]</w:t>
+      </w:r>
+    </w:p>
+    <w:p>
+      <w:pPr>
+        <w:spacing w:after="80"/>
+      </w:pPr>
+      <w:r>
+        <w:t xml:space="preserve">• </w:t>
+      </w:r>
+      <w:r>
+        <w:rPr>
+          <w:i w:val="0"/>
+        </w:rPr>
+        <w:t xml:space="preserve">Ngoumou RD. How does the experience of the medical encounter with Mayer-Rokitansky-Küster-Hauser (MRKH) syndrome impact women in Africa? </w:t>
+      </w:r>
+      <w:r>
+        <w:rPr>
+          <w:i/>
+        </w:rPr>
+        <w:t>Pan Afr Med J</w:t>
+      </w:r>
+      <w:r>
+        <w:rPr>
+          <w:i w:val="0"/>
+        </w:rPr>
+        <w:t>. 2022;42:314. doi:10.11604/pamj.2022.42.314.32830</w:t>
+      </w:r>
+    </w:p>
+    <w:p>
+      <w:pPr>
+        <w:spacing w:after="80"/>
+      </w:pPr>
+      <w:r>
+        <w:t xml:space="preserve">• </w:t>
+      </w:r>
+      <w:r>
+        <w:rPr>
+          <w:i w:val="0"/>
+        </w:rPr>
+        <w:t xml:space="preserve">Pennesi CM, Berkeley J, Lossie AC, Quint EH, Zieman KD, Carroll S. International experiences with vaginal lengthening treatment among individuals with Müllerian agenesis: a mixed-methods study. </w:t>
+      </w:r>
+      <w:r>
+        <w:rPr>
+          <w:i/>
+        </w:rPr>
+        <w:t>J Pediatr Adolesc Gynecol</w:t>
+      </w:r>
+      <w:r>
+        <w:rPr>
+          <w:i w:val="0"/>
+        </w:rPr>
+        <w:t>. 2023;36(5):476-483. doi:10.1016/j.jpag.2023.05.004</w:t>
+      </w:r>
+    </w:p>
+    <w:p>
+      <w:pPr>
+        <w:spacing w:after="80"/>
+      </w:pPr>
+      <w:r>
+        <w:t xml:space="preserve">• </w:t>
+      </w:r>
+      <w:r>
+        <w:rPr>
+          <w:i w:val="0"/>
+        </w:rPr>
+        <w:t xml:space="preserve">Pittman J, Gerstl B, Walch A, Lotz M, Deans R, Morrison N. Psychological well-being of women with uterine infertility before considering uterus transplantation as a treatment option. </w:t>
+      </w:r>
+      <w:r>
+        <w:rPr>
+          <w:i/>
+        </w:rPr>
+        <w:t>Aust N Z J Obstet Gynaecol</w:t>
+      </w:r>
+      <w:r>
+        <w:rPr>
+          <w:i w:val="0"/>
+        </w:rPr>
+        <w:t>. 2025;65(2):263-268. doi:10.1111/ajo.13895</w:t>
+      </w:r>
+    </w:p>
+    <w:p>
+      <w:pPr>
+        <w:spacing w:after="80"/>
+      </w:pPr>
+      <w:r>
+        <w:t xml:space="preserve">• </w:t>
+      </w:r>
+      <w:r>
+        <w:rPr>
+          <w:i w:val="0"/>
+        </w:rPr>
+        <w:t xml:space="preserve">Rajesh Z, Marshall N, Hunker KE, et al. Understanding the impact of Mayer-Rokitansky-Küster-Hauser syndrome on sexual wellbeing—a qualitative study. </w:t>
+      </w:r>
+      <w:r>
+        <w:rPr>
+          <w:i/>
+        </w:rPr>
+        <w:t>J Sex Med</w:t>
+      </w:r>
+      <w:r>
+        <w:rPr>
+          <w:i w:val="0"/>
+        </w:rPr>
+        <w:t>. 2026;23(1):qdaf309. doi:10.1093/jsxmed/qdaf309</w:t>
+      </w:r>
+    </w:p>
+    <w:p>
+      <w:pPr>
+        <w:spacing w:after="80"/>
+      </w:pPr>
+      <w:r>
+        <w:t xml:space="preserve">• </w:t>
+      </w:r>
+      <w:r>
+        <w:rPr>
+          <w:i w:val="0"/>
+        </w:rPr>
+        <w:t xml:space="preserve">Rall K, Schenk B, Schäffeler N, et al. Long term findings concerning the mental and physical condition, quality of life and sexuality after laparoscopically assisted creation of a neovagina (modified Vecchietti technique) in young MRKHS (Mayer-Rokitansky-Küster-Hauser-Syndrome) patients. </w:t>
+      </w:r>
+      <w:r>
+        <w:rPr>
+          <w:i/>
+        </w:rPr>
+        <w:t>J Clin Med</w:t>
+      </w:r>
+      <w:r>
+        <w:rPr>
+          <w:i w:val="0"/>
+        </w:rPr>
+        <w:t>. 2021;10(6):1269. doi:10.3390/jcm10061269 [poster ref 14]</w:t>
+      </w:r>
+    </w:p>
+    <w:p>
+      <w:pPr>
+        <w:spacing w:after="80"/>
+      </w:pPr>
+      <w:r>
+        <w:t xml:space="preserve">• </w:t>
+      </w:r>
+      <w:r>
+        <w:rPr>
+          <w:i w:val="0"/>
+        </w:rPr>
+        <w:t xml:space="preserve">Sabatucci I, Palaia I, Marchese C, et al. Treatment of the Mayer-Rokitansky-Küster-Hauser syndrome with autologous in vitro cultured vaginal tissue: descriptive study of long-term results and patient outcomes. </w:t>
+      </w:r>
+      <w:r>
+        <w:rPr>
+          <w:i/>
+        </w:rPr>
+        <w:t>BJOG</w:t>
+      </w:r>
+      <w:r>
+        <w:rPr>
+          <w:i w:val="0"/>
+        </w:rPr>
+        <w:t>. 2019;126(1):123-127. doi:10.1111/1471-0528.15477</w:t>
+      </w:r>
+    </w:p>
+    <w:p>
+      <w:pPr>
+        <w:spacing w:after="80"/>
+      </w:pPr>
+      <w:r>
+        <w:t xml:space="preserve">• </w:t>
+      </w:r>
+      <w:r>
+        <w:rPr>
+          <w:i w:val="0"/>
+        </w:rPr>
+        <w:t xml:space="preserve">Scollo P, Pecorino B, La Spina S, Veroux P, Giaquinta A, Scibilia G. Psychological and personality assessment in patients candidates for uterus transplantation from deceased donor: preliminary results. </w:t>
+      </w:r>
+      <w:r>
+        <w:rPr>
+          <w:i/>
+        </w:rPr>
+        <w:t>Ital J Gynaecol Obstet</w:t>
+      </w:r>
+      <w:r>
+        <w:rPr>
+          <w:i w:val="0"/>
+        </w:rPr>
+        <w:t>. 2020;32(4):287-292. doi:10.36129/jog.32.04.08</w:t>
+      </w:r>
+    </w:p>
+    <w:p>
+      <w:pPr>
+        <w:spacing w:after="80"/>
+      </w:pPr>
+      <w:r>
+        <w:t xml:space="preserve">• </w:t>
+      </w:r>
+      <w:r>
+        <w:rPr>
+          <w:i w:val="0"/>
+        </w:rPr>
+        <w:t xml:space="preserve">Shao S, Wang X, Lei X, Hua K, Zhang Y. Psychological intervention in women with Mayer-Rokitansky-Küster-Hauser syndrome after artificial vaginoplasty: a prospective study. </w:t>
+      </w:r>
+      <w:r>
+        <w:rPr>
+          <w:i/>
+        </w:rPr>
+        <w:t>Int Urogynecol J</w:t>
+      </w:r>
+      <w:r>
+        <w:rPr>
+          <w:i w:val="0"/>
+        </w:rPr>
+        <w:t>. 2022;33(3):723-729. doi:10.1007/s00192-022-05075-y [poster ref 20]</w:t>
+      </w:r>
+    </w:p>
+    <w:p>
+      <w:pPr>
+        <w:spacing w:after="80"/>
+      </w:pPr>
+      <w:r>
+        <w:t xml:space="preserve">• </w:t>
+      </w:r>
+      <w:r>
+        <w:rPr>
+          <w:i w:val="0"/>
+        </w:rPr>
+        <w:t xml:space="preserve">Song S, Chen N, Duan YP, et al. Anxiety symptoms in patients with Mayer-Rokitansky-Küster-Hauser syndrome: a cross-sectional study. </w:t>
+      </w:r>
+      <w:r>
+        <w:rPr>
+          <w:i/>
+        </w:rPr>
+        <w:t>Chin Med J (Engl)</w:t>
+      </w:r>
+      <w:r>
+        <w:rPr>
+          <w:i w:val="0"/>
+        </w:rPr>
+        <w:t>. 2020;133(4):388-394. doi:10.1097/cm9.0000000000000648</w:t>
+      </w:r>
+    </w:p>
+    <w:p>
+      <w:pPr>
+        <w:spacing w:after="80"/>
+      </w:pPr>
+      <w:r>
+        <w:t xml:space="preserve">• </w:t>
+      </w:r>
+      <w:r>
+        <w:rPr>
+          <w:i w:val="0"/>
+        </w:rPr>
+        <w:t xml:space="preserve">Sorouri Khorashad B, Kaabi O, Gardner MD, et al. Psychiatric comorbidities in women with complete androgen insensitivity syndrome or Müllerian duct aplasia/agenesis. </w:t>
+      </w:r>
+      <w:r>
+        <w:rPr>
+          <w:i/>
+        </w:rPr>
+        <w:t>J Clin Endocrinol Metab</w:t>
+      </w:r>
+      <w:r>
+        <w:rPr>
+          <w:i w:val="0"/>
+        </w:rPr>
+        <w:t>. 2025;110(7):1906-1914. doi:10.1210/clinem/dgae720</w:t>
+      </w:r>
+    </w:p>
+    <w:p>
+      <w:pPr>
+        <w:spacing w:after="80"/>
+      </w:pPr>
+      <w:r>
+        <w:t xml:space="preserve">• </w:t>
+      </w:r>
+      <w:r>
+        <w:rPr>
+          <w:i w:val="0"/>
+        </w:rPr>
+        <w:t xml:space="preserve">Stepanow C, Naderer A, Alexopoulos J, Walch K, Wenzl R, Leithner K. Sexual health and sexual well-being of women with Mayer-Rokitansky-Kuester-Hauser syndrome after vaginal reconstruction: a qualitative analysis. </w:t>
+      </w:r>
+      <w:r>
+        <w:rPr>
+          <w:i/>
+        </w:rPr>
+        <w:t>J Sex Med</w:t>
+      </w:r>
+      <w:r>
+        <w:rPr>
+          <w:i w:val="0"/>
+        </w:rPr>
+        <w:t>. 2023;20(1):57-64. doi:10.1093/jsxmed/qdac011</w:t>
+      </w:r>
+    </w:p>
+    <w:p>
+      <w:pPr>
+        <w:spacing w:after="80"/>
+      </w:pPr>
+      <w:r>
+        <w:t xml:space="preserve">• </w:t>
+      </w:r>
+      <w:r>
+        <w:rPr>
+          <w:i w:val="0"/>
+        </w:rPr>
+        <w:t xml:space="preserve">Tsitoura A, Michala L. The sexuality of adolescents and young women with MRKH syndrome: a qualitative study. </w:t>
+      </w:r>
+      <w:r>
+        <w:rPr>
+          <w:i/>
+        </w:rPr>
+        <w:t>J Sex Med</w:t>
+      </w:r>
+      <w:r>
+        <w:rPr>
+          <w:i w:val="0"/>
+        </w:rPr>
+        <w:t>. 2021;18(12):2012-2019. doi:10.1016/j.jsxm.2021.09.006</w:t>
+      </w:r>
+    </w:p>
+    <w:p>
+      <w:pPr>
+        <w:spacing w:after="80"/>
+      </w:pPr>
+      <w:r>
+        <w:t xml:space="preserve">• </w:t>
+      </w:r>
+      <w:r>
+        <w:rPr>
+          <w:i w:val="0"/>
+        </w:rPr>
+        <w:t xml:space="preserve">Vosoughi N, Maasoumi R, Haeri Mehrizi AA, Ghanbari Z. The effect of psychosexual education on promoting sexual function, genital self-image, and sexual distress among women with Rokitansky syndrome: a randomized controlled clinical trial. </w:t>
+      </w:r>
+      <w:r>
+        <w:rPr>
+          <w:i/>
+        </w:rPr>
+        <w:t>J Pediatr Adolesc Gynecol</w:t>
+      </w:r>
+      <w:r>
+        <w:rPr>
+          <w:i w:val="0"/>
+        </w:rPr>
+        <w:t>. 2022;35(1):73-81. doi:10.1016/j.jpag.2021.06.008 [poster ref 21]</w:t>
+      </w:r>
+    </w:p>
+    <w:p>
+      <w:pPr>
+        <w:spacing w:after="80"/>
+      </w:pPr>
+      <w:r>
+        <w:t xml:space="preserve">• </w:t>
+      </w:r>
+      <w:r>
+        <w:rPr>
+          <w:i w:val="0"/>
+        </w:rPr>
+        <w:t xml:space="preserve">Weijenborg PTM, Kluivers KB, Dessens AB, ten Kate-Booij MJ, Both S. Sexual functioning, sexual esteem, genital self-image and psychological and relational functioning in women with Mayer-Rokitansky-Küster-Hauser syndrome: a case-control study. </w:t>
+      </w:r>
+      <w:r>
+        <w:rPr>
+          <w:i/>
+        </w:rPr>
+        <w:t>Hum Reprod</w:t>
+      </w:r>
+      <w:r>
+        <w:rPr>
+          <w:i w:val="0"/>
+        </w:rPr>
+        <w:t>. 2019;34(9):1661-1673. doi:10.1093/humrep/dez130 [poster ref 10]</w:t>
       </w:r>
     </w:p>
     <w:p>
@@ -657,12 +1554,7 @@
         <w:pStyle w:val="Heading2"/>
       </w:pPr>
       <w:r>
-        <w:t>B. All 35 studies included in the scoping review</w:t>
-      </w:r>
-    </w:p>
-    <w:p>
-      <w:r>
-        <w:t>Listed alphabetically by first author. Studies also cited on the poster show their poster reference number in brackets.</w:t>
+        <w:t>C. Additional background references (manuscript)</w:t>
       </w:r>
     </w:p>
     <w:p>
@@ -676,19 +1568,19 @@
         <w:rPr>
           <w:i w:val="0"/>
         </w:rPr>
-        <w:t xml:space="preserve">Arsy GR, Ratnawati R, Rachmawati SD. Low self-esteem of women suffering Mayer Rokitansky Kuster Hauser syndrome. </w:t>
+        <w:t xml:space="preserve">Herlin MK, Petersen MB, Brännström M. Mayer-Rokitansky-Küster-Hauser (MRKH) syndrome: a comprehensive update. </w:t>
       </w:r>
       <w:r>
         <w:rPr>
           <w:i/>
         </w:rPr>
-        <w:t>Indian J Public Health Res Dev</w:t>
+        <w:t>Orphanet J Rare Dis</w:t>
       </w:r>
       <w:r>
         <w:rPr>
           <w:i w:val="0"/>
         </w:rPr>
-        <w:t>. 2019;10(8):2042-2045. doi:10.5958/0976-5506.2019.02155.7</w:t>
+        <w:t>. 2020;15(1):214. doi:10.1186/s13023-020-01491-9</w:t>
       </w:r>
     </w:p>
     <w:p>
@@ -702,19 +1594,19 @@
         <w:rPr>
           <w:i w:val="0"/>
         </w:rPr>
-        <w:t xml:space="preserve">Beisert MJ, Chodecka AM, Walczyk-Matyja K, Szymańska-Pytlińska ME, Kędzia W, Kapczuk K. Psychological correlates of sexual self-esteem in young women with Mayer-Rokitansky-Küster-Hauser syndrome. </w:t>
+        <w:t xml:space="preserve">Bean EJ, Mazur T, Robinson AD. Mayer-Rokitansky-Küster-Hauser syndrome: sexuality, psychological effects, and quality of life. </w:t>
       </w:r>
       <w:r>
         <w:rPr>
           <w:i/>
         </w:rPr>
-        <w:t>Curr Issues Personal Psychol</w:t>
+        <w:t>J Pediatr Adolesc Gynecol</w:t>
       </w:r>
       <w:r>
         <w:rPr>
           <w:i w:val="0"/>
         </w:rPr>
-        <w:t>. 2022;10(4):333-342. doi:10.5114/cipp.2022.114044 [poster ref 11]</w:t>
+        <w:t>. 2009;22(6):339-346. doi:10.1016/j.jpag.2008.11.006</w:t>
       </w:r>
     </w:p>
     <w:p>
@@ -728,19 +1620,19 @@
         <w:rPr>
           <w:i w:val="0"/>
         </w:rPr>
-        <w:t xml:space="preserve">Carroll S, Laufer MR, Thomas-Kowal P, Lossie AC, Moss-Morris R. From engulfment to enrichment: associations between illness representations, self-concept, and psychological adjustment in Mayer-Rokitansky-Küster-Hauser syndrome. </w:t>
+        <w:t xml:space="preserve">Patterson CJ, Crawford R, Jahoda A. Exploring the psychological impact of Mayer-Rokitansky-Küster-Hauser syndrome on young women: an interpretative phenomenological analysis. </w:t>
       </w:r>
       <w:r>
         <w:rPr>
           <w:i/>
         </w:rPr>
-        <w:t>J Pediatr Adolesc Gynecol</w:t>
+        <w:t>J Health Psychol</w:t>
       </w:r>
       <w:r>
         <w:rPr>
           <w:i w:val="0"/>
         </w:rPr>
-        <w:t>. 2020;33(6):639-648. doi:10.1016/j.jpag.2020.07.006 [poster ref 15]</w:t>
+        <w:t>. 2016;21(7):1228-1240. doi:10.1177/1359105314551077</w:t>
       </w:r>
     </w:p>
     <w:p>
@@ -754,19 +1646,19 @@
         <w:rPr>
           <w:i w:val="0"/>
         </w:rPr>
-        <w:t xml:space="preserve">Chen N, Song S, Duan Y, et al. Study on depressive symptoms in patients with Mayer-Rokitansky-Küster-Hauser syndrome: an analysis of 141 cases. </w:t>
+        <w:t xml:space="preserve">Mak S, Thomas A. Steps for conducting a scoping review. </w:t>
       </w:r>
       <w:r>
         <w:rPr>
           <w:i/>
         </w:rPr>
-        <w:t>Orphanet J Rare Dis</w:t>
+        <w:t>J Grad Med Educ</w:t>
       </w:r>
       <w:r>
         <w:rPr>
           <w:i w:val="0"/>
         </w:rPr>
-        <w:t>. 2020;15(1):121. doi:10.1186/s13023-020-01405-9 [poster ref 16]</w:t>
+        <w:t>. 2022;14(5):565-567. doi:10.4300/JGME-D-22-00621.1</w:t>
       </w:r>
     </w:p>
     <w:p>
@@ -780,215 +1672,7 @@
         <w:rPr>
           <w:i w:val="0"/>
         </w:rPr>
-        <w:t xml:space="preserve">Di Mattei VE, Taranto P, Perego G, et al. Illness experience and (unmet) needs of women with Mayer-Rokitansky-Küster-Hauser syndrome (MRKH): a qualitative analysis of an online forum. </w:t>
-      </w:r>
-      <w:r>
-        <w:rPr>
-          <w:i/>
-        </w:rPr>
-        <w:t>Psychol Health</w:t>
-      </w:r>
-      <w:r>
-        <w:rPr>
-          <w:i w:val="0"/>
-        </w:rPr>
-        <w:t>. 2026;41(1):53-75. doi:10.1080/08870446.2024.2390647</w:t>
-      </w:r>
-    </w:p>
-    <w:p>
-      <w:pPr>
-        <w:spacing w:after="80"/>
-      </w:pPr>
-      <w:r>
-        <w:t xml:space="preserve">• </w:t>
-      </w:r>
-      <w:r>
-        <w:rPr>
-          <w:i w:val="0"/>
-        </w:rPr>
-        <w:t xml:space="preserve">Gilfillan R, Carter P. Issues of identity, perceptions and isolation: an interpretative phenomenological analysis of women's experience of Mayer-Rokitansky-Küster-Hauser (MRKH) syndrome. </w:t>
-      </w:r>
-      <w:r>
-        <w:rPr>
-          <w:i/>
-        </w:rPr>
-        <w:t>J Health Psychol</w:t>
-      </w:r>
-      <w:r>
-        <w:rPr>
-          <w:i w:val="0"/>
-        </w:rPr>
-        <w:t>. 2024;29(3):200-212. doi:10.1177/13591053231199253</w:t>
-      </w:r>
-    </w:p>
-    <w:p>
-      <w:pPr>
-        <w:spacing w:after="80"/>
-      </w:pPr>
-      <w:r>
-        <w:t xml:space="preserve">• </w:t>
-      </w:r>
-      <w:r>
-        <w:rPr>
-          <w:i w:val="0"/>
-        </w:rPr>
-        <w:t xml:space="preserve">Güner P, Ulukaya T, Pehlivan Sarıbudak T. "I felt like a woman": a phenomenological qualitative study of disease-related experiences in Mayer-Rokitansky-Küster-Hauser syndrome (MRKH syndrome). </w:t>
-      </w:r>
-      <w:r>
-        <w:rPr>
-          <w:i/>
-        </w:rPr>
-        <w:t>J Health Psychol</w:t>
-      </w:r>
-      <w:r>
-        <w:rPr>
-          <w:i w:val="0"/>
-        </w:rPr>
-        <w:t>. 2025;30(11):3137-3152. doi:10.1177/13591053241305941 [poster ref 12]</w:t>
-      </w:r>
-    </w:p>
-    <w:p>
-      <w:pPr>
-        <w:spacing w:after="80"/>
-      </w:pPr>
-      <w:r>
-        <w:t xml:space="preserve">• </w:t>
-      </w:r>
-      <w:r>
-        <w:rPr>
-          <w:i w:val="0"/>
-        </w:rPr>
-        <w:t xml:space="preserve">Güner P, Ulukaya T. From avoidance to empowerment: coping strategies in women with Müllerian agenesis (MRKH) after McIndoe reconstruction: a descriptive phenomenological study. </w:t>
-      </w:r>
-      <w:r>
-        <w:rPr>
-          <w:i/>
-        </w:rPr>
-        <w:t>J Pediatr Adolesc Gynecol</w:t>
-      </w:r>
-      <w:r>
-        <w:rPr>
-          <w:i w:val="0"/>
-        </w:rPr>
-        <w:t>. 2026;39(1):101-108. doi:10.1016/j.jpag.2025.10.013 [poster ref 19]</w:t>
-      </w:r>
-    </w:p>
-    <w:p>
-      <w:pPr>
-        <w:spacing w:after="80"/>
-      </w:pPr>
-      <w:r>
-        <w:t xml:space="preserve">• </w:t>
-      </w:r>
-      <w:r>
-        <w:rPr>
-          <w:i w:val="0"/>
-        </w:rPr>
-        <w:t xml:space="preserve">Hatim H, Zainuddin AA, Anizah A, et al. The missing uterus, the missed diagnosis, and the missing care. Mayer-Rokitansky-Küster-Hauser syndrome in the lives of women in Malaysia. </w:t>
-      </w:r>
-      <w:r>
-        <w:rPr>
-          <w:i/>
-        </w:rPr>
-        <w:t>J Pediatr Adolesc Gynecol</w:t>
-      </w:r>
-      <w:r>
-        <w:rPr>
-          <w:i w:val="0"/>
-        </w:rPr>
-        <w:t>. 2021;34(2):161-167. doi:10.1016/j.jpag.2020.11.009 [poster ref 23]</w:t>
-      </w:r>
-    </w:p>
-    <w:p>
-      <w:pPr>
-        <w:spacing w:after="80"/>
-      </w:pPr>
-      <w:r>
-        <w:t xml:space="preserve">• </w:t>
-      </w:r>
-      <w:r>
-        <w:rPr>
-          <w:i w:val="0"/>
-        </w:rPr>
-        <w:t xml:space="preserve">Jensen AH, Herlin MK, Trolle B, Vogel I, Lou S. Experiences of vaginal lengthening treatment and sexual well-being in women with Mayer-Rokitansky-Küster-Hauser (MRKH) syndrome: an interview study. </w:t>
-      </w:r>
-      <w:r>
-        <w:rPr>
-          <w:i/>
-        </w:rPr>
-        <w:t>BJOG</w:t>
-      </w:r>
-      <w:r>
-        <w:rPr>
-          <w:i w:val="0"/>
-        </w:rPr>
-        <w:t>. 2024;131(13):1841-1850. doi:10.1111/1471-0528.17916</w:t>
-      </w:r>
-    </w:p>
-    <w:p>
-      <w:pPr>
-        <w:spacing w:after="80"/>
-      </w:pPr>
-      <w:r>
-        <w:t xml:space="preserve">• </w:t>
-      </w:r>
-      <w:r>
-        <w:rPr>
-          <w:i w:val="0"/>
-        </w:rPr>
-        <w:t xml:space="preserve">Jensen AH, Herlin MK, Vogel I, Lou S. A life course perspective on Mayer-Rokitansky-Küster-Hauser syndrome: women's experiences and negotiations of living with an underdeveloped uterus and vagina. </w:t>
-      </w:r>
-      <w:r>
-        <w:rPr>
-          <w:i/>
-        </w:rPr>
-        <w:t>Disabil Rehabil</w:t>
-      </w:r>
-      <w:r>
-        <w:rPr>
-          <w:i w:val="0"/>
-        </w:rPr>
-        <w:t>. 2024;46(6):1130-1140. doi:10.1080/09638288.2023.2191014</w:t>
-      </w:r>
-    </w:p>
-    <w:p>
-      <w:pPr>
-        <w:spacing w:after="80"/>
-      </w:pPr>
-      <w:r>
-        <w:t xml:space="preserve">• </w:t>
-      </w:r>
-      <w:r>
-        <w:rPr>
-          <w:i w:val="0"/>
-        </w:rPr>
-        <w:t xml:space="preserve">Jha S, Singh S. Sexual and psychosocial outcome after neovaginoplasty using Interceed in females with Mayer-Rokitansky-Küster-Hauser syndrome: a case-control study. </w:t>
-      </w:r>
-      <w:r>
-        <w:rPr>
-          <w:i/>
-        </w:rPr>
-        <w:t>J Obstet Gynaecol Can</w:t>
-      </w:r>
-      <w:r>
-        <w:rPr>
-          <w:i w:val="0"/>
-        </w:rPr>
-        <w:t>. 2022;44(8):926-930. doi:10.1016/j.jogc.2022.03.018</w:t>
-      </w:r>
-    </w:p>
-    <w:p>
-      <w:pPr>
-        <w:spacing w:after="80"/>
-      </w:pPr>
-      <w:r>
-        <w:t xml:space="preserve">• </w:t>
-      </w:r>
-      <w:r>
-        <w:rPr>
-          <w:i w:val="0"/>
-        </w:rPr>
-        <w:t xml:space="preserve">Järvholm S, Enskog A, Hammarling C, Dahm-Kähler P, Brännström M. Uterus transplantation: joys and frustrations of becoming a "complete" woman—a qualitative study regarding self-image in the 5-year period after transplantation. </w:t>
+        <w:t xml:space="preserve">Heller-Boersma JG, Schmidt UH, Edmonds DK. A randomized controlled trial of a cognitive-behavioural group intervention versus waiting-list control for women with uterovaginal agenesis (Mayer-Rokitansky-Küster-Hauser syndrome: MRKH). </w:t>
       </w:r>
       <w:r>
         <w:rPr>
@@ -1000,691 +1684,7 @@
         <w:rPr>
           <w:i w:val="0"/>
         </w:rPr>
-        <w:t>. 2020;35(8):1855-1863. doi:10.1093/humrep/deaa143</w:t>
-      </w:r>
-    </w:p>
-    <w:p>
-      <w:pPr>
-        <w:spacing w:after="80"/>
-      </w:pPr>
-      <w:r>
-        <w:t xml:space="preserve">• </w:t>
-      </w:r>
-      <w:r>
-        <w:rPr>
-          <w:i w:val="0"/>
-        </w:rPr>
-        <w:t xml:space="preserve">Kang J, Chen N, Song S, et al. Sexual function and quality of life after the creation of a neovagina in women with Mayer-Rokitansky-Küster-Hauser syndrome: comparison of vaginal dilation and surgical procedures. </w:t>
-      </w:r>
-      <w:r>
-        <w:rPr>
-          <w:i/>
-        </w:rPr>
-        <w:t>Fertil Steril</w:t>
-      </w:r>
-      <w:r>
-        <w:rPr>
-          <w:i w:val="0"/>
-        </w:rPr>
-        <w:t>. 2020;113(5):1024-1031. doi:10.1016/j.fertnstert.2020.01.017</w:t>
-      </w:r>
-    </w:p>
-    <w:p>
-      <w:pPr>
-        <w:spacing w:after="80"/>
-      </w:pPr>
-      <w:r>
-        <w:t xml:space="preserve">• </w:t>
-      </w:r>
-      <w:r>
-        <w:rPr>
-          <w:i w:val="0"/>
-        </w:rPr>
-        <w:t xml:space="preserve">Karpel L, Nicaise M, Carbonnel M, et al. Psychological evaluation of candidates for the uterus transplantation French trial. </w:t>
-      </w:r>
-      <w:r>
-        <w:rPr>
-          <w:i/>
-        </w:rPr>
-        <w:t>Acta Obstet Gynecol Scand</w:t>
-      </w:r>
-      <w:r>
-        <w:rPr>
-          <w:i w:val="0"/>
-        </w:rPr>
-        <w:t>. 2025;104(3):522-527. doi:10.1111/aogs.15004 [poster ref 18]</w:t>
-      </w:r>
-    </w:p>
-    <w:p>
-      <w:pPr>
-        <w:spacing w:after="80"/>
-      </w:pPr>
-      <w:r>
-        <w:t xml:space="preserve">• </w:t>
-      </w:r>
-      <w:r>
-        <w:rPr>
-          <w:i w:val="0"/>
-        </w:rPr>
-        <w:t xml:space="preserve">Khairudin KB, Nik Mhd Nor NS, Childs JF, et al. Prevalence of anxiety and depression in women with Mayer-Rokitansky-Küster-Hauser (MRKH) syndrome in Malaysia. </w:t>
-      </w:r>
-      <w:r>
-        <w:rPr>
-          <w:i/>
-        </w:rPr>
-        <w:t>J Pediatr Adolesc Gynecol</w:t>
-      </w:r>
-      <w:r>
-        <w:rPr>
-          <w:i w:val="0"/>
-        </w:rPr>
-        <w:t>. 2026;39(2):215-220. doi:10.1016/j.jpag.2025.11.005 [poster ref 17]</w:t>
-      </w:r>
-    </w:p>
-    <w:p>
-      <w:pPr>
-        <w:spacing w:after="80"/>
-      </w:pPr>
-      <w:r>
-        <w:t xml:space="preserve">• </w:t>
-      </w:r>
-      <w:r>
-        <w:rPr>
-          <w:i w:val="0"/>
-        </w:rPr>
-        <w:t xml:space="preserve">Le TTQ, Le NTH, Vu TA, Nguyen HH, Vuong LN. Perception of having children through surrogacy in individuals with MRKH in Vietnam: a qualitative study. </w:t>
-      </w:r>
-      <w:r>
-        <w:rPr>
-          <w:i/>
-        </w:rPr>
-        <w:t>Front Psychol</w:t>
-      </w:r>
-      <w:r>
-        <w:rPr>
-          <w:i w:val="0"/>
-        </w:rPr>
-        <w:t>. 2024;15:1372405. doi:10.3389/fpsyg.2024.1372405</w:t>
-      </w:r>
-    </w:p>
-    <w:p>
-      <w:pPr>
-        <w:spacing w:after="80"/>
-      </w:pPr>
-      <w:r>
-        <w:t xml:space="preserve">• </w:t>
-      </w:r>
-      <w:r>
-        <w:rPr>
-          <w:i w:val="0"/>
-        </w:rPr>
-        <w:t xml:space="preserve">Lei XH, Wang X, Shao SY, Hua KQ, Zhang Y. Self-esteem, depression, anxiety and sexual function in Mayer-Rokitansky-Küster-Hauser syndrome with neovagina: a case series. </w:t>
-      </w:r>
-      <w:r>
-        <w:rPr>
-          <w:i/>
-        </w:rPr>
-        <w:t>Eur J Obstet Gynecol Reprod Biol</w:t>
-      </w:r>
-      <w:r>
-        <w:rPr>
-          <w:i w:val="0"/>
-        </w:rPr>
-        <w:t>. 2024;298:85-90. doi:10.1016/j.ejogrb.2024.04.027</w:t>
-      </w:r>
-    </w:p>
-    <w:p>
-      <w:pPr>
-        <w:spacing w:after="80"/>
-      </w:pPr>
-      <w:r>
-        <w:t xml:space="preserve">• </w:t>
-      </w:r>
-      <w:r>
-        <w:rPr>
-          <w:i w:val="0"/>
-        </w:rPr>
-        <w:t xml:space="preserve">Lou S, Jensen AH, Vogel I, Trolle B, Herlin MK. Understanding the diagnostic odyssey of women with Mayer-Rokitansky-Küster-Hauser (MRKH) syndrome in Denmark: a qualitative interview study. </w:t>
-      </w:r>
-      <w:r>
-        <w:rPr>
-          <w:i/>
-        </w:rPr>
-        <w:t>J Pediatr Adolesc Gynecol</w:t>
-      </w:r>
-      <w:r>
-        <w:rPr>
-          <w:i w:val="0"/>
-        </w:rPr>
-        <w:t>. 2024;37(4):412-418. doi:10.1016/j.jpag.2024.03.003 [poster ref 13]</w:t>
-      </w:r>
-    </w:p>
-    <w:p>
-      <w:pPr>
-        <w:spacing w:after="80"/>
-      </w:pPr>
-      <w:r>
-        <w:t xml:space="preserve">• </w:t>
-      </w:r>
-      <w:r>
-        <w:rPr>
-          <w:i w:val="0"/>
-        </w:rPr>
-        <w:t xml:space="preserve">Mao M, Zhang Y, Fu H, Wang Q, Bai J, Guo R. Long-term results of sexual function and body image after vaginoplasty with acellular dermal matrix in women with Mayer-Rokitansky-Küster-Hauser syndrome. </w:t>
-      </w:r>
-      <w:r>
-        <w:rPr>
-          <w:i/>
-        </w:rPr>
-        <w:t>J Minim Invasive Gynecol</w:t>
-      </w:r>
-      <w:r>
-        <w:rPr>
-          <w:i w:val="0"/>
-        </w:rPr>
-        <w:t>. 2024;31(1):37-42. doi:10.1016/j.jmig.2023.10.003</w:t>
-      </w:r>
-    </w:p>
-    <w:p>
-      <w:pPr>
-        <w:spacing w:after="80"/>
-      </w:pPr>
-      <w:r>
-        <w:t xml:space="preserve">• </w:t>
-      </w:r>
-      <w:r>
-        <w:rPr>
-          <w:i w:val="0"/>
-        </w:rPr>
-        <w:t xml:space="preserve">Marshall N, Rajesh Z, Hunker K, et al. "Don't give up, advocate for yourself": a pilot study examining healthcare experiences of people with Mayer Rokitansky Küster Hauser syndrome. </w:t>
-      </w:r>
-      <w:r>
-        <w:rPr>
-          <w:i/>
-        </w:rPr>
-        <w:t>J Pediatr Adolesc Gynecol</w:t>
-      </w:r>
-      <w:r>
-        <w:rPr>
-          <w:i w:val="0"/>
-        </w:rPr>
-        <w:t>. 2025;38(2):167-173. doi:10.1016/j.jpag.2024.12.001 [poster ref 22]</w:t>
-      </w:r>
-    </w:p>
-    <w:p>
-      <w:pPr>
-        <w:spacing w:after="80"/>
-      </w:pPr>
-      <w:r>
-        <w:t xml:space="preserve">• </w:t>
-      </w:r>
-      <w:r>
-        <w:rPr>
-          <w:i w:val="0"/>
-        </w:rPr>
-        <w:t xml:space="preserve">Ngoumou RD. How does the experience of the medical encounter with Mayer-Rokitansky-Küster-Hauser (MRKH) syndrome impact women in Africa? </w:t>
-      </w:r>
-      <w:r>
-        <w:rPr>
-          <w:i/>
-        </w:rPr>
-        <w:t>Pan Afr Med J</w:t>
-      </w:r>
-      <w:r>
-        <w:rPr>
-          <w:i w:val="0"/>
-        </w:rPr>
-        <w:t>. 2022;42:314. doi:10.11604/pamj.2022.42.314.32830</w:t>
-      </w:r>
-    </w:p>
-    <w:p>
-      <w:pPr>
-        <w:spacing w:after="80"/>
-      </w:pPr>
-      <w:r>
-        <w:t xml:space="preserve">• </w:t>
-      </w:r>
-      <w:r>
-        <w:rPr>
-          <w:i w:val="0"/>
-        </w:rPr>
-        <w:t xml:space="preserve">Pennesi CM, Berkeley J, Lossie AC, Quint EH, Zieman KD, Carroll S. International experiences with vaginal lengthening treatment among individuals with Müllerian agenesis: a mixed-methods study. </w:t>
-      </w:r>
-      <w:r>
-        <w:rPr>
-          <w:i/>
-        </w:rPr>
-        <w:t>J Pediatr Adolesc Gynecol</w:t>
-      </w:r>
-      <w:r>
-        <w:rPr>
-          <w:i w:val="0"/>
-        </w:rPr>
-        <w:t>. 2023;36(5):476-483. doi:10.1016/j.jpag.2023.05.004</w:t>
-      </w:r>
-    </w:p>
-    <w:p>
-      <w:pPr>
-        <w:spacing w:after="80"/>
-      </w:pPr>
-      <w:r>
-        <w:t xml:space="preserve">• </w:t>
-      </w:r>
-      <w:r>
-        <w:rPr>
-          <w:i w:val="0"/>
-        </w:rPr>
-        <w:t xml:space="preserve">Pittman J, Gerstl B, Walch A, Lotz M, Deans R, Morrison N. Psychological well-being of women with uterine infertility before considering uterus transplantation as a treatment option. </w:t>
-      </w:r>
-      <w:r>
-        <w:rPr>
-          <w:i/>
-        </w:rPr>
-        <w:t>Aust N Z J Obstet Gynaecol</w:t>
-      </w:r>
-      <w:r>
-        <w:rPr>
-          <w:i w:val="0"/>
-        </w:rPr>
-        <w:t>. 2025;65(2):263-268. doi:10.1111/ajo.13895</w:t>
-      </w:r>
-    </w:p>
-    <w:p>
-      <w:pPr>
-        <w:spacing w:after="80"/>
-      </w:pPr>
-      <w:r>
-        <w:t xml:space="preserve">• </w:t>
-      </w:r>
-      <w:r>
-        <w:rPr>
-          <w:i w:val="0"/>
-        </w:rPr>
-        <w:t xml:space="preserve">Rajesh Z, Marshall N, Hunker KE, et al. Understanding the impact of Mayer-Rokitansky-Küster-Hauser syndrome on sexual wellbeing—a qualitative study. </w:t>
-      </w:r>
-      <w:r>
-        <w:rPr>
-          <w:i/>
-        </w:rPr>
-        <w:t>J Sex Med</w:t>
-      </w:r>
-      <w:r>
-        <w:rPr>
-          <w:i w:val="0"/>
-        </w:rPr>
-        <w:t>. 2026;23(1):qdaf309. doi:10.1093/jsxmed/qdaf309</w:t>
-      </w:r>
-    </w:p>
-    <w:p>
-      <w:pPr>
-        <w:spacing w:after="80"/>
-      </w:pPr>
-      <w:r>
-        <w:t xml:space="preserve">• </w:t>
-      </w:r>
-      <w:r>
-        <w:rPr>
-          <w:i w:val="0"/>
-        </w:rPr>
-        <w:t xml:space="preserve">Rall K, Schenk B, Schäffeler N, et al. Long term findings concerning the mental and physical condition, quality of life and sexuality after laparoscopically assisted creation of a neovagina (modified Vecchietti technique) in young MRKHS (Mayer-Rokitansky-Küster-Hauser-Syndrome) patients. </w:t>
-      </w:r>
-      <w:r>
-        <w:rPr>
-          <w:i/>
-        </w:rPr>
-        <w:t>J Clin Med</w:t>
-      </w:r>
-      <w:r>
-        <w:rPr>
-          <w:i w:val="0"/>
-        </w:rPr>
-        <w:t>. 2021;10(6):1269. doi:10.3390/jcm10061269 [poster ref 14]</w:t>
-      </w:r>
-    </w:p>
-    <w:p>
-      <w:pPr>
-        <w:spacing w:after="80"/>
-      </w:pPr>
-      <w:r>
-        <w:t xml:space="preserve">• </w:t>
-      </w:r>
-      <w:r>
-        <w:rPr>
-          <w:i w:val="0"/>
-        </w:rPr>
-        <w:t xml:space="preserve">Sabatucci I, Palaia I, Marchese C, et al. Treatment of the Mayer-Rokitansky-Küster-Hauser syndrome with autologous in vitro cultured vaginal tissue: descriptive study of long-term results and patient outcomes. </w:t>
-      </w:r>
-      <w:r>
-        <w:rPr>
-          <w:i/>
-        </w:rPr>
-        <w:t>BJOG</w:t>
-      </w:r>
-      <w:r>
-        <w:rPr>
-          <w:i w:val="0"/>
-        </w:rPr>
-        <w:t>. 2019;126(1):123-127. doi:10.1111/1471-0528.15477</w:t>
-      </w:r>
-    </w:p>
-    <w:p>
-      <w:pPr>
-        <w:spacing w:after="80"/>
-      </w:pPr>
-      <w:r>
-        <w:t xml:space="preserve">• </w:t>
-      </w:r>
-      <w:r>
-        <w:rPr>
-          <w:i w:val="0"/>
-        </w:rPr>
-        <w:t xml:space="preserve">Scollo P, Pecorino B, La Spina S, Veroux P, Giaquinta A, Scibilia G. Psychological and personality assessment in patients candidates for uterus transplantation from deceased donor: preliminary results. </w:t>
-      </w:r>
-      <w:r>
-        <w:rPr>
-          <w:i/>
-        </w:rPr>
-        <w:t>Ital J Gynaecol Obstet</w:t>
-      </w:r>
-      <w:r>
-        <w:rPr>
-          <w:i w:val="0"/>
-        </w:rPr>
-        <w:t>. 2020;32(4):287-292. doi:10.36129/jog.32.04.08</w:t>
-      </w:r>
-    </w:p>
-    <w:p>
-      <w:pPr>
-        <w:spacing w:after="80"/>
-      </w:pPr>
-      <w:r>
-        <w:t xml:space="preserve">• </w:t>
-      </w:r>
-      <w:r>
-        <w:rPr>
-          <w:i w:val="0"/>
-        </w:rPr>
-        <w:t xml:space="preserve">Shao S, Wang X, Lei X, Hua K, Zhang Y. Psychological intervention in women with Mayer-Rokitansky-Küster-Hauser syndrome after artificial vaginoplasty: a prospective study. </w:t>
-      </w:r>
-      <w:r>
-        <w:rPr>
-          <w:i/>
-        </w:rPr>
-        <w:t>Int Urogynecol J</w:t>
-      </w:r>
-      <w:r>
-        <w:rPr>
-          <w:i w:val="0"/>
-        </w:rPr>
-        <w:t>. 2022;33(3):723-729. doi:10.1007/s00192-022-05075-y [poster ref 20]</w:t>
-      </w:r>
-    </w:p>
-    <w:p>
-      <w:pPr>
-        <w:spacing w:after="80"/>
-      </w:pPr>
-      <w:r>
-        <w:t xml:space="preserve">• </w:t>
-      </w:r>
-      <w:r>
-        <w:rPr>
-          <w:i w:val="0"/>
-        </w:rPr>
-        <w:t xml:space="preserve">Song S, Chen N, Duan YP, et al. Anxiety symptoms in patients with Mayer-Rokitansky-Küster-Hauser syndrome: a cross-sectional study. </w:t>
-      </w:r>
-      <w:r>
-        <w:rPr>
-          <w:i/>
-        </w:rPr>
-        <w:t>Chin Med J (Engl)</w:t>
-      </w:r>
-      <w:r>
-        <w:rPr>
-          <w:i w:val="0"/>
-        </w:rPr>
-        <w:t>. 2020;133(4):388-394. doi:10.1097/cm9.0000000000000648</w:t>
-      </w:r>
-    </w:p>
-    <w:p>
-      <w:pPr>
-        <w:spacing w:after="80"/>
-      </w:pPr>
-      <w:r>
-        <w:t xml:space="preserve">• </w:t>
-      </w:r>
-      <w:r>
-        <w:rPr>
-          <w:i w:val="0"/>
-        </w:rPr>
-        <w:t xml:space="preserve">Sorouri Khorashad B, Kaabi O, Gardner MD, et al. Psychiatric comorbidities in women with complete androgen insensitivity syndrome or Müllerian duct aplasia/agenesis. </w:t>
-      </w:r>
-      <w:r>
-        <w:rPr>
-          <w:i/>
-        </w:rPr>
-        <w:t>J Clin Endocrinol Metab</w:t>
-      </w:r>
-      <w:r>
-        <w:rPr>
-          <w:i w:val="0"/>
-        </w:rPr>
-        <w:t>. 2025;110(7):1906-1914. doi:10.1210/clinem/dgae720</w:t>
-      </w:r>
-    </w:p>
-    <w:p>
-      <w:pPr>
-        <w:spacing w:after="80"/>
-      </w:pPr>
-      <w:r>
-        <w:t xml:space="preserve">• </w:t>
-      </w:r>
-      <w:r>
-        <w:rPr>
-          <w:i w:val="0"/>
-        </w:rPr>
-        <w:t xml:space="preserve">Stepanow C, Naderer A, Alexopoulos J, Walch K, Wenzl R, Leithner K. Sexual health and sexual well-being of women with Mayer-Rokitansky-Kuester-Hauser syndrome after vaginal reconstruction: a qualitative analysis. </w:t>
-      </w:r>
-      <w:r>
-        <w:rPr>
-          <w:i/>
-        </w:rPr>
-        <w:t>J Sex Med</w:t>
-      </w:r>
-      <w:r>
-        <w:rPr>
-          <w:i w:val="0"/>
-        </w:rPr>
-        <w:t>. 2023;20(1):57-64. doi:10.1093/jsxmed/qdac011</w:t>
-      </w:r>
-    </w:p>
-    <w:p>
-      <w:pPr>
-        <w:spacing w:after="80"/>
-      </w:pPr>
-      <w:r>
-        <w:t xml:space="preserve">• </w:t>
-      </w:r>
-      <w:r>
-        <w:rPr>
-          <w:i w:val="0"/>
-        </w:rPr>
-        <w:t xml:space="preserve">Tsitoura A, Michala L. The sexuality of adolescents and young women with MRKH syndrome: a qualitative study. </w:t>
-      </w:r>
-      <w:r>
-        <w:rPr>
-          <w:i/>
-        </w:rPr>
-        <w:t>J Sex Med</w:t>
-      </w:r>
-      <w:r>
-        <w:rPr>
-          <w:i w:val="0"/>
-        </w:rPr>
-        <w:t>. 2021;18(12):2012-2019. doi:10.1016/j.jsxm.2021.09.006</w:t>
-      </w:r>
-    </w:p>
-    <w:p>
-      <w:pPr>
-        <w:spacing w:after="80"/>
-      </w:pPr>
-      <w:r>
-        <w:t xml:space="preserve">• </w:t>
-      </w:r>
-      <w:r>
-        <w:rPr>
-          <w:i w:val="0"/>
-        </w:rPr>
-        <w:t xml:space="preserve">Vosoughi N, Maasoumi R, Haeri Mehrizi AA, Ghanbari Z. The effect of psychosexual education on promoting sexual function, genital self-image, and sexual distress among women with Rokitansky syndrome: a randomized controlled clinical trial. </w:t>
-      </w:r>
-      <w:r>
-        <w:rPr>
-          <w:i/>
-        </w:rPr>
-        <w:t>J Pediatr Adolesc Gynecol</w:t>
-      </w:r>
-      <w:r>
-        <w:rPr>
-          <w:i w:val="0"/>
-        </w:rPr>
-        <w:t>. 2022;35(1):73-81. doi:10.1016/j.jpag.2021.06.008 [poster ref 21]</w:t>
-      </w:r>
-    </w:p>
-    <w:p>
-      <w:pPr>
-        <w:spacing w:after="80"/>
-      </w:pPr>
-      <w:r>
-        <w:t xml:space="preserve">• </w:t>
-      </w:r>
-      <w:r>
-        <w:rPr>
-          <w:i w:val="0"/>
-        </w:rPr>
-        <w:t xml:space="preserve">Weijenborg PTM, Kluivers KB, Dessens AB, ten Kate-Booij MJ, Both S. Sexual functioning, sexual esteem, genital self-image and psychological and relational functioning in women with Mayer-Rokitansky-Küster-Hauser syndrome: a case-control study. </w:t>
-      </w:r>
-      <w:r>
-        <w:rPr>
-          <w:i/>
-        </w:rPr>
-        <w:t>Hum Reprod</w:t>
-      </w:r>
-      <w:r>
-        <w:rPr>
-          <w:i w:val="0"/>
-        </w:rPr>
-        <w:t>. 2019;34(9):1661-1673. doi:10.1093/humrep/dez130 [poster ref 10]</w:t>
-      </w:r>
-    </w:p>
-    <w:p>
-      <w:pPr>
-        <w:pStyle w:val="Heading2"/>
-      </w:pPr>
-      <w:r>
-        <w:t>C. Additional background references (manuscript)</w:t>
-      </w:r>
-    </w:p>
-    <w:p>
-      <w:pPr>
-        <w:spacing w:after="80"/>
-      </w:pPr>
-      <w:r>
-        <w:t xml:space="preserve">• </w:t>
-      </w:r>
-      <w:r>
-        <w:rPr>
-          <w:i w:val="0"/>
-        </w:rPr>
-        <w:t xml:space="preserve">Herlin MK, Petersen MB, Brännström M. Mayer-Rokitansky-Küster-Hauser (MRKH) syndrome: a comprehensive update. </w:t>
-      </w:r>
-      <w:r>
-        <w:rPr>
-          <w:i/>
-        </w:rPr>
-        <w:t>Orphanet J Rare Dis</w:t>
-      </w:r>
-      <w:r>
-        <w:rPr>
-          <w:i w:val="0"/>
-        </w:rPr>
-        <w:t>. 2020;15(1):214. doi:10.1186/s13023-020-01491-9</w:t>
-      </w:r>
-    </w:p>
-    <w:p>
-      <w:pPr>
-        <w:spacing w:after="80"/>
-      </w:pPr>
-      <w:r>
-        <w:t xml:space="preserve">• </w:t>
-      </w:r>
-      <w:r>
-        <w:rPr>
-          <w:i w:val="0"/>
-        </w:rPr>
-        <w:t xml:space="preserve">Bean EJ, Mazur T, Robinson AD. Mayer-Rokitansky-Küster-Hauser syndrome: sexuality, psychological effects, and quality of life. </w:t>
-      </w:r>
-      <w:r>
-        <w:rPr>
-          <w:i/>
-        </w:rPr>
-        <w:t>J Pediatr Adolesc Gynecol</w:t>
-      </w:r>
-      <w:r>
-        <w:rPr>
-          <w:i w:val="0"/>
-        </w:rPr>
-        <w:t>. 2009;22(6):339-346. doi:10.1016/j.jpag.2008.11.006</w:t>
-      </w:r>
-    </w:p>
-    <w:p>
-      <w:pPr>
-        <w:spacing w:after="80"/>
-      </w:pPr>
-      <w:r>
-        <w:t xml:space="preserve">• </w:t>
-      </w:r>
-      <w:r>
-        <w:rPr>
-          <w:i w:val="0"/>
-        </w:rPr>
-        <w:t xml:space="preserve">Patterson CJ, Crawford R, Jahoda A. Exploring the psychological impact of Mayer-Rokitansky-Küster-Hauser syndrome on young women: an interpretative phenomenological analysis. </w:t>
-      </w:r>
-      <w:r>
-        <w:rPr>
-          <w:i/>
-        </w:rPr>
-        <w:t>J Health Psychol</w:t>
-      </w:r>
-      <w:r>
-        <w:rPr>
-          <w:i w:val="0"/>
-        </w:rPr>
-        <w:t>. 2016;21(7):1228-1240. doi:10.1177/1359105314551077</w:t>
-      </w:r>
-    </w:p>
-    <w:p>
-      <w:pPr>
-        <w:spacing w:after="80"/>
-      </w:pPr>
-      <w:r>
-        <w:t xml:space="preserve">• </w:t>
-      </w:r>
-      <w:r>
-        <w:rPr>
-          <w:i w:val="0"/>
-        </w:rPr>
-        <w:t xml:space="preserve">Mak S, Thomas A. Steps for conducting a scoping review. </w:t>
-      </w:r>
-      <w:r>
-        <w:rPr>
-          <w:i/>
-        </w:rPr>
-        <w:t>J Grad Med Educ</w:t>
-      </w:r>
-      <w:r>
-        <w:rPr>
-          <w:i w:val="0"/>
-        </w:rPr>
-        <w:t>. 2022;14(5):565-567. doi:10.4300/JGME-D-22-00621.1</w:t>
+        <w:t>. 2007;22(8):2296-2301. doi:10.1093/humrep/dem167</w:t>
       </w:r>
     </w:p>
     <w:p>

</xml_diff>

<commit_message>
Poster: drop non-essential in-text citations
Co-Authored-By: Claude Opus 5.5 <noreply@anthropic.com>
Claude-Session: https://claude.ai/code/session_01N468nYR7vy45HpujgUezn5
</commit_message>
<xml_diff>
--- a/poster/Poster_Full_Reference_List.docx
+++ b/poster/Poster_Full_Reference_List.docx
@@ -325,32 +325,6 @@
         <w:rPr>
           <w:i w:val="0"/>
         </w:rPr>
-        <w:t xml:space="preserve">Güner P, Ulukaya T, Pehlivan Sarıbudak T. "I felt like a woman": a phenomenological qualitative study of disease-related experiences in Mayer-Rokitansky-Küster-Hauser syndrome (MRKH syndrome). </w:t>
-      </w:r>
-      <w:r>
-        <w:rPr>
-          <w:i/>
-        </w:rPr>
-        <w:t>J Health Psychol</w:t>
-      </w:r>
-      <w:r>
-        <w:rPr>
-          <w:i w:val="0"/>
-        </w:rPr>
-        <w:t>. 2025;30(11):3137-3152. doi:10.1177/13591053241305941</w:t>
-      </w:r>
-    </w:p>
-    <w:p>
-      <w:pPr>
-        <w:spacing w:after="80"/>
-      </w:pPr>
-      <w:r>
-        <w:t xml:space="preserve">13. </w:t>
-      </w:r>
-      <w:r>
-        <w:rPr>
-          <w:i w:val="0"/>
-        </w:rPr>
         <w:t xml:space="preserve">Lou S, Jensen AH, Vogel I, Trolle B, Herlin MK. Understanding the diagnostic odyssey of women with Mayer-Rokitansky-Küster-Hauser (MRKH) syndrome in Denmark: a qualitative interview study. </w:t>
       </w:r>
       <w:r>
@@ -371,7 +345,7 @@
         <w:spacing w:after="80"/>
       </w:pPr>
       <w:r>
-        <w:t xml:space="preserve">14. </w:t>
+        <w:t xml:space="preserve">13. </w:t>
       </w:r>
       <w:r>
         <w:rPr>
@@ -397,7 +371,7 @@
         <w:spacing w:after="80"/>
       </w:pPr>
       <w:r>
-        <w:t xml:space="preserve">15. </w:t>
+        <w:t xml:space="preserve">14. </w:t>
       </w:r>
       <w:r>
         <w:rPr>
@@ -423,7 +397,7 @@
         <w:spacing w:after="80"/>
       </w:pPr>
       <w:r>
-        <w:t xml:space="preserve">16. </w:t>
+        <w:t xml:space="preserve">15. </w:t>
       </w:r>
       <w:r>
         <w:rPr>
@@ -449,7 +423,7 @@
         <w:spacing w:after="80"/>
       </w:pPr>
       <w:r>
-        <w:t xml:space="preserve">17. </w:t>
+        <w:t xml:space="preserve">16. </w:t>
       </w:r>
       <w:r>
         <w:rPr>
@@ -475,7 +449,7 @@
         <w:spacing w:after="80"/>
       </w:pPr>
       <w:r>
-        <w:t xml:space="preserve">18. </w:t>
+        <w:t xml:space="preserve">17. </w:t>
       </w:r>
       <w:r>
         <w:rPr>
@@ -501,7 +475,7 @@
         <w:spacing w:after="80"/>
       </w:pPr>
       <w:r>
-        <w:t xml:space="preserve">19. </w:t>
+        <w:t xml:space="preserve">18. </w:t>
       </w:r>
       <w:r>
         <w:rPr>
@@ -527,7 +501,7 @@
         <w:spacing w:after="80"/>
       </w:pPr>
       <w:r>
-        <w:t xml:space="preserve">20. </w:t>
+        <w:t xml:space="preserve">19. </w:t>
       </w:r>
       <w:r>
         <w:rPr>
@@ -553,7 +527,7 @@
         <w:spacing w:after="80"/>
       </w:pPr>
       <w:r>
-        <w:t xml:space="preserve">21. </w:t>
+        <w:t xml:space="preserve">20. </w:t>
       </w:r>
       <w:r>
         <w:rPr>
@@ -572,58 +546,6 @@
           <w:i w:val="0"/>
         </w:rPr>
         <w:t>. 2022;35(1):73-81. doi:10.1016/j.jpag.2021.06.008</w:t>
-      </w:r>
-    </w:p>
-    <w:p>
-      <w:pPr>
-        <w:spacing w:after="80"/>
-      </w:pPr>
-      <w:r>
-        <w:t xml:space="preserve">22. </w:t>
-      </w:r>
-      <w:r>
-        <w:rPr>
-          <w:i w:val="0"/>
-        </w:rPr>
-        <w:t xml:space="preserve">Marshall N, Rajesh Z, Hunker K, et al. "Don't give up, advocate for yourself": a pilot study examining healthcare experiences of people with Mayer Rokitansky Küster Hauser syndrome. </w:t>
-      </w:r>
-      <w:r>
-        <w:rPr>
-          <w:i/>
-        </w:rPr>
-        <w:t>J Pediatr Adolesc Gynecol</w:t>
-      </w:r>
-      <w:r>
-        <w:rPr>
-          <w:i w:val="0"/>
-        </w:rPr>
-        <w:t>. 2025;38(2):167-173. doi:10.1016/j.jpag.2024.12.001</w:t>
-      </w:r>
-    </w:p>
-    <w:p>
-      <w:pPr>
-        <w:spacing w:after="80"/>
-      </w:pPr>
-      <w:r>
-        <w:t xml:space="preserve">23. </w:t>
-      </w:r>
-      <w:r>
-        <w:rPr>
-          <w:i w:val="0"/>
-        </w:rPr>
-        <w:t xml:space="preserve">Hatim H, Zainuddin AA, Anizah A, et al. The missing uterus, the missed diagnosis, and the missing care. Mayer-Rokitansky-Küster-Hauser syndrome in the lives of women in Malaysia. </w:t>
-      </w:r>
-      <w:r>
-        <w:rPr>
-          <w:i/>
-        </w:rPr>
-        <w:t>J Pediatr Adolesc Gynecol</w:t>
-      </w:r>
-      <w:r>
-        <w:rPr>
-          <w:i w:val="0"/>
-        </w:rPr>
-        <w:t>. 2021;34(2):161-167. doi:10.1016/j.jpag.2020.11.009</w:t>
       </w:r>
     </w:p>
     <w:p>
@@ -714,7 +636,7 @@
         <w:rPr>
           <w:i w:val="0"/>
         </w:rPr>
-        <w:t>. 2020;33(6):639-648. doi:10.1016/j.jpag.2020.07.006 [poster ref 15]</w:t>
+        <w:t>. 2020;33(6):639-648. doi:10.1016/j.jpag.2020.07.006 [poster ref 14]</w:t>
       </w:r>
     </w:p>
     <w:p>
@@ -740,7 +662,7 @@
         <w:rPr>
           <w:i w:val="0"/>
         </w:rPr>
-        <w:t>. 2020;15(1):121. doi:10.1186/s13023-020-01405-9 [poster ref 16]</w:t>
+        <w:t>. 2020;15(1):121. doi:10.1186/s13023-020-01405-9 [poster ref 15]</w:t>
       </w:r>
     </w:p>
     <w:p>
@@ -818,7 +740,7 @@
         <w:rPr>
           <w:i w:val="0"/>
         </w:rPr>
-        <w:t>. 2025;30(11):3137-3152. doi:10.1177/13591053241305941 [poster ref 12]</w:t>
+        <w:t>. 2025;30(11):3137-3152. doi:10.1177/13591053241305941</w:t>
       </w:r>
     </w:p>
     <w:p>
@@ -844,7 +766,7 @@
         <w:rPr>
           <w:i w:val="0"/>
         </w:rPr>
-        <w:t>. 2026;39(1):101-108. doi:10.1016/j.jpag.2025.10.013 [poster ref 19]</w:t>
+        <w:t>. 2026;39(1):101-108. doi:10.1016/j.jpag.2025.10.013 [poster ref 18]</w:t>
       </w:r>
     </w:p>
     <w:p>
@@ -870,7 +792,7 @@
         <w:rPr>
           <w:i w:val="0"/>
         </w:rPr>
-        <w:t>. 2021;34(2):161-167. doi:10.1016/j.jpag.2020.11.009 [poster ref 23]</w:t>
+        <w:t>. 2021;34(2):161-167. doi:10.1016/j.jpag.2020.11.009</w:t>
       </w:r>
     </w:p>
     <w:p>
@@ -1026,7 +948,7 @@
         <w:rPr>
           <w:i w:val="0"/>
         </w:rPr>
-        <w:t>. 2025;104(3):522-527. doi:10.1111/aogs.15004 [poster ref 18]</w:t>
+        <w:t>. 2025;104(3):522-527. doi:10.1111/aogs.15004 [poster ref 17]</w:t>
       </w:r>
     </w:p>
     <w:p>
@@ -1052,7 +974,7 @@
         <w:rPr>
           <w:i w:val="0"/>
         </w:rPr>
-        <w:t>. 2026;39(2):215-220. doi:10.1016/j.jpag.2025.11.005 [poster ref 17]</w:t>
+        <w:t>. 2026;39(2):215-220. doi:10.1016/j.jpag.2025.11.005 [poster ref 16]</w:t>
       </w:r>
     </w:p>
     <w:p>
@@ -1130,7 +1052,7 @@
         <w:rPr>
           <w:i w:val="0"/>
         </w:rPr>
-        <w:t>. 2024;37(4):412-418. doi:10.1016/j.jpag.2024.03.003 [poster ref 13]</w:t>
+        <w:t>. 2024;37(4):412-418. doi:10.1016/j.jpag.2024.03.003 [poster ref 12]</w:t>
       </w:r>
     </w:p>
     <w:p>
@@ -1182,7 +1104,7 @@
         <w:rPr>
           <w:i w:val="0"/>
         </w:rPr>
-        <w:t>. 2025;38(2):167-173. doi:10.1016/j.jpag.2024.12.001 [poster ref 22]</w:t>
+        <w:t>. 2025;38(2):167-173. doi:10.1016/j.jpag.2024.12.001</w:t>
       </w:r>
     </w:p>
     <w:p>
@@ -1312,7 +1234,7 @@
         <w:rPr>
           <w:i w:val="0"/>
         </w:rPr>
-        <w:t>. 2021;10(6):1269. doi:10.3390/jcm10061269 [poster ref 14]</w:t>
+        <w:t>. 2021;10(6):1269. doi:10.3390/jcm10061269 [poster ref 13]</w:t>
       </w:r>
     </w:p>
     <w:p>
@@ -1390,7 +1312,7 @@
         <w:rPr>
           <w:i w:val="0"/>
         </w:rPr>
-        <w:t>. 2022;33(3):723-729. doi:10.1007/s00192-022-05075-y [poster ref 20]</w:t>
+        <w:t>. 2022;33(3):723-729. doi:10.1007/s00192-022-05075-y [poster ref 19]</w:t>
       </w:r>
     </w:p>
     <w:p>
@@ -1520,7 +1442,7 @@
         <w:rPr>
           <w:i w:val="0"/>
         </w:rPr>
-        <w:t>. 2022;35(1):73-81. doi:10.1016/j.jpag.2021.06.008 [poster ref 21]</w:t>
+        <w:t>. 2022;35(1):73-81. doi:10.1016/j.jpag.2021.06.008 [poster ref 20]</w:t>
       </w:r>
     </w:p>
     <w:p>

</xml_diff>

<commit_message>
Poster: Results written as a results section; study counts instead of percentages; moderate-to-severe depression figure; intervention point moved to Discussion
Co-Authored-By: Claude Opus 5.5 <noreply@anthropic.com>
Claude-Session: https://claude.ai/code/session_01N468nYR7vy45HpujgUezn5
</commit_message>
<xml_diff>
--- a/poster/Poster_Full_Reference_List.docx
+++ b/poster/Poster_Full_Reference_List.docx
@@ -351,32 +351,6 @@
         <w:rPr>
           <w:i w:val="0"/>
         </w:rPr>
-        <w:t xml:space="preserve">Rall K, Schenk B, Schäffeler N, et al. Long term findings concerning the mental and physical condition, quality of life and sexuality after laparoscopically assisted creation of a neovagina (modified Vecchietti technique) in young MRKHS (Mayer-Rokitansky-Küster-Hauser-Syndrome) patients. </w:t>
-      </w:r>
-      <w:r>
-        <w:rPr>
-          <w:i/>
-        </w:rPr>
-        <w:t>J Clin Med</w:t>
-      </w:r>
-      <w:r>
-        <w:rPr>
-          <w:i w:val="0"/>
-        </w:rPr>
-        <w:t>. 2021;10(6):1269. doi:10.3390/jcm10061269</w:t>
-      </w:r>
-    </w:p>
-    <w:p>
-      <w:pPr>
-        <w:spacing w:after="80"/>
-      </w:pPr>
-      <w:r>
-        <w:t xml:space="preserve">14. </w:t>
-      </w:r>
-      <w:r>
-        <w:rPr>
-          <w:i w:val="0"/>
-        </w:rPr>
         <w:t xml:space="preserve">Carroll S, Laufer MR, Thomas-Kowal P, Lossie AC, Moss-Morris R. From engulfment to enrichment: associations between illness representations, self-concept, and psychological adjustment in Mayer-Rokitansky-Küster-Hauser syndrome. </w:t>
       </w:r>
       <w:r>
@@ -397,7 +371,7 @@
         <w:spacing w:after="80"/>
       </w:pPr>
       <w:r>
-        <w:t xml:space="preserve">15. </w:t>
+        <w:t xml:space="preserve">14. </w:t>
       </w:r>
       <w:r>
         <w:rPr>
@@ -423,7 +397,7 @@
         <w:spacing w:after="80"/>
       </w:pPr>
       <w:r>
-        <w:t xml:space="preserve">16. </w:t>
+        <w:t xml:space="preserve">15. </w:t>
       </w:r>
       <w:r>
         <w:rPr>
@@ -449,7 +423,7 @@
         <w:spacing w:after="80"/>
       </w:pPr>
       <w:r>
-        <w:t xml:space="preserve">17. </w:t>
+        <w:t xml:space="preserve">16. </w:t>
       </w:r>
       <w:r>
         <w:rPr>
@@ -475,33 +449,7 @@
         <w:spacing w:after="80"/>
       </w:pPr>
       <w:r>
-        <w:t xml:space="preserve">18. </w:t>
-      </w:r>
-      <w:r>
-        <w:rPr>
-          <w:i w:val="0"/>
-        </w:rPr>
-        <w:t xml:space="preserve">Güner P, Ulukaya T. From avoidance to empowerment: coping strategies in women with Müllerian agenesis (MRKH) after McIndoe reconstruction: a descriptive phenomenological study. </w:t>
-      </w:r>
-      <w:r>
-        <w:rPr>
-          <w:i/>
-        </w:rPr>
-        <w:t>J Pediatr Adolesc Gynecol</w:t>
-      </w:r>
-      <w:r>
-        <w:rPr>
-          <w:i w:val="0"/>
-        </w:rPr>
-        <w:t>. 2026;39(1):101-108. doi:10.1016/j.jpag.2025.10.013</w:t>
-      </w:r>
-    </w:p>
-    <w:p>
-      <w:pPr>
-        <w:spacing w:after="80"/>
-      </w:pPr>
-      <w:r>
-        <w:t xml:space="preserve">19. </w:t>
+        <w:t xml:space="preserve">17. </w:t>
       </w:r>
       <w:r>
         <w:rPr>
@@ -527,7 +475,7 @@
         <w:spacing w:after="80"/>
       </w:pPr>
       <w:r>
-        <w:t xml:space="preserve">20. </w:t>
+        <w:t xml:space="preserve">18. </w:t>
       </w:r>
       <w:r>
         <w:rPr>
@@ -636,7 +584,7 @@
         <w:rPr>
           <w:i w:val="0"/>
         </w:rPr>
-        <w:t>. 2020;33(6):639-648. doi:10.1016/j.jpag.2020.07.006 [poster ref 14]</w:t>
+        <w:t>. 2020;33(6):639-648. doi:10.1016/j.jpag.2020.07.006 [poster ref 13]</w:t>
       </w:r>
     </w:p>
     <w:p>
@@ -662,7 +610,7 @@
         <w:rPr>
           <w:i w:val="0"/>
         </w:rPr>
-        <w:t>. 2020;15(1):121. doi:10.1186/s13023-020-01405-9 [poster ref 15]</w:t>
+        <w:t>. 2020;15(1):121. doi:10.1186/s13023-020-01405-9 [poster ref 14]</w:t>
       </w:r>
     </w:p>
     <w:p>
@@ -766,7 +714,7 @@
         <w:rPr>
           <w:i w:val="0"/>
         </w:rPr>
-        <w:t>. 2026;39(1):101-108. doi:10.1016/j.jpag.2025.10.013 [poster ref 18]</w:t>
+        <w:t>. 2026;39(1):101-108. doi:10.1016/j.jpag.2025.10.013</w:t>
       </w:r>
     </w:p>
     <w:p>
@@ -948,7 +896,7 @@
         <w:rPr>
           <w:i w:val="0"/>
         </w:rPr>
-        <w:t>. 2025;104(3):522-527. doi:10.1111/aogs.15004 [poster ref 17]</w:t>
+        <w:t>. 2025;104(3):522-527. doi:10.1111/aogs.15004 [poster ref 16]</w:t>
       </w:r>
     </w:p>
     <w:p>
@@ -974,7 +922,7 @@
         <w:rPr>
           <w:i w:val="0"/>
         </w:rPr>
-        <w:t>. 2026;39(2):215-220. doi:10.1016/j.jpag.2025.11.005 [poster ref 16]</w:t>
+        <w:t>. 2026;39(2):215-220. doi:10.1016/j.jpag.2025.11.005 [poster ref 15]</w:t>
       </w:r>
     </w:p>
     <w:p>
@@ -1234,7 +1182,7 @@
         <w:rPr>
           <w:i w:val="0"/>
         </w:rPr>
-        <w:t>. 2021;10(6):1269. doi:10.3390/jcm10061269 [poster ref 13]</w:t>
+        <w:t>. 2021;10(6):1269. doi:10.3390/jcm10061269</w:t>
       </w:r>
     </w:p>
     <w:p>
@@ -1312,7 +1260,7 @@
         <w:rPr>
           <w:i w:val="0"/>
         </w:rPr>
-        <w:t>. 2022;33(3):723-729. doi:10.1007/s00192-022-05075-y [poster ref 19]</w:t>
+        <w:t>. 2022;33(3):723-729. doi:10.1007/s00192-022-05075-y [poster ref 17]</w:t>
       </w:r>
     </w:p>
     <w:p>
@@ -1442,7 +1390,7 @@
         <w:rPr>
           <w:i w:val="0"/>
         </w:rPr>
-        <w:t>. 2022;35(1):73-81. doi:10.1016/j.jpag.2021.06.008 [poster ref 20]</w:t>
+        <w:t>. 2022;35(1):73-81. doi:10.1016/j.jpag.2021.06.008 [poster ref 18]</w:t>
       </w:r>
     </w:p>
     <w:p>

</xml_diff>

<commit_message>
AMA: citation before semicolon on poster; accent-insensitive alphabetical order in full reference list
Co-Authored-By: Claude Opus 5.5 <noreply@anthropic.com>
Claude-Session: https://claude.ai/code/session_01N468nYR7vy45HpujgUezn5
</commit_message>
<xml_diff>
--- a/poster/Poster_Full_Reference_List.docx
+++ b/poster/Poster_Full_Reference_List.docx
@@ -754,6 +754,32 @@
         <w:rPr>
           <w:i w:val="0"/>
         </w:rPr>
+        <w:t xml:space="preserve">Järvholm S, Enskog A, Hammarling C, Dahm-Kähler P, Brännström M. Uterus transplantation: joys and frustrations of becoming a "complete" woman—a qualitative study regarding self-image in the 5-year period after transplantation. </w:t>
+      </w:r>
+      <w:r>
+        <w:rPr>
+          <w:i/>
+        </w:rPr>
+        <w:t>Hum Reprod</w:t>
+      </w:r>
+      <w:r>
+        <w:rPr>
+          <w:i w:val="0"/>
+        </w:rPr>
+        <w:t>. 2020;35(8):1855-1863. doi:10.1093/humrep/deaa143</w:t>
+      </w:r>
+    </w:p>
+    <w:p>
+      <w:pPr>
+        <w:spacing w:after="80"/>
+      </w:pPr>
+      <w:r>
+        <w:t xml:space="preserve">• </w:t>
+      </w:r>
+      <w:r>
+        <w:rPr>
+          <w:i w:val="0"/>
+        </w:rPr>
         <w:t xml:space="preserve">Jensen AH, Herlin MK, Trolle B, Vogel I, Lou S. Experiences of vaginal lengthening treatment and sexual well-being in women with Mayer-Rokitansky-Küster-Hauser (MRKH) syndrome: an interview study. </w:t>
       </w:r>
       <w:r>
@@ -819,32 +845,6 @@
           <w:i w:val="0"/>
         </w:rPr>
         <w:t>. 2022;44(8):926-930. doi:10.1016/j.jogc.2022.03.018</w:t>
-      </w:r>
-    </w:p>
-    <w:p>
-      <w:pPr>
-        <w:spacing w:after="80"/>
-      </w:pPr>
-      <w:r>
-        <w:t xml:space="preserve">• </w:t>
-      </w:r>
-      <w:r>
-        <w:rPr>
-          <w:i w:val="0"/>
-        </w:rPr>
-        <w:t xml:space="preserve">Järvholm S, Enskog A, Hammarling C, Dahm-Kähler P, Brännström M. Uterus transplantation: joys and frustrations of becoming a "complete" woman—a qualitative study regarding self-image in the 5-year period after transplantation. </w:t>
-      </w:r>
-      <w:r>
-        <w:rPr>
-          <w:i/>
-        </w:rPr>
-        <w:t>Hum Reprod</w:t>
-      </w:r>
-      <w:r>
-        <w:rPr>
-          <w:i w:val="0"/>
-        </w:rPr>
-        <w:t>. 2020;35(8):1855-1863. doi:10.1093/humrep/deaa143</w:t>
       </w:r>
     </w:p>
     <w:p>

</xml_diff>

<commit_message>
Full reference list: one numbered AMA list (1-50) under the title only
Co-Authored-By: Claude Opus 5.5 <noreply@anthropic.com>
Claude-Session: https://claude.ai/code/session_01N468nYR7vy45HpujgUezn5
</commit_message>
<xml_diff>
--- a/poster/Poster_Full_Reference_List.docx
+++ b/poster/Poster_Full_Reference_List.docx
@@ -8,24 +8,6 @@
       </w:pPr>
       <w:r>
         <w:t>Mental Health and Psychosocial Outcomes Among Individuals With Mayer-Rokitansky-Küster-Hauser (MRKH) Syndrome: A Scoping Review</w:t>
-      </w:r>
-    </w:p>
-    <w:p>
-      <w:r>
-        <w:t>Ifeoluwanimi P. Shobayo, BSc, MSPHc; Paul Okojie, PhD; Robyn Anderson, PhD. Department of Public and Community Health, Liberty University. APHA 2026 Annual Meeting poster — full reference list (AMA style).</w:t>
-      </w:r>
-    </w:p>
-    <w:p>
-      <w:pPr>
-        <w:pStyle w:val="Heading2"/>
-      </w:pPr>
-      <w:r>
-        <w:t>A. References cited on the poster</w:t>
-      </w:r>
-    </w:p>
-    <w:p>
-      <w:r>
-        <w:t>Numbered as they appear on the poster.</w:t>
       </w:r>
     </w:p>
     <w:p>
@@ -498,23 +480,10 @@
     </w:p>
     <w:p>
       <w:pPr>
-        <w:pStyle w:val="Heading2"/>
-      </w:pPr>
-      <w:r>
-        <w:t>B. All 35 studies included in the scoping review</w:t>
-      </w:r>
-    </w:p>
-    <w:p>
-      <w:r>
-        <w:t>Listed alphabetically by first author. Studies also cited on the poster show their poster reference number in brackets.</w:t>
-      </w:r>
-    </w:p>
-    <w:p>
-      <w:pPr>
         <w:spacing w:after="80"/>
       </w:pPr>
       <w:r>
-        <w:t xml:space="preserve">• </w:t>
+        <w:t xml:space="preserve">19. </w:t>
       </w:r>
       <w:r>
         <w:rPr>
@@ -540,85 +509,7 @@
         <w:spacing w:after="80"/>
       </w:pPr>
       <w:r>
-        <w:t xml:space="preserve">• </w:t>
-      </w:r>
-      <w:r>
-        <w:rPr>
-          <w:i w:val="0"/>
-        </w:rPr>
-        <w:t xml:space="preserve">Beisert MJ, Chodecka AM, Walczyk-Matyja K, Szymańska-Pytlińska ME, Kędzia W, Kapczuk K. Psychological correlates of sexual self-esteem in young women with Mayer-Rokitansky-Küster-Hauser syndrome. </w:t>
-      </w:r>
-      <w:r>
-        <w:rPr>
-          <w:i/>
-        </w:rPr>
-        <w:t>Curr Issues Personal Psychol</w:t>
-      </w:r>
-      <w:r>
-        <w:rPr>
-          <w:i w:val="0"/>
-        </w:rPr>
-        <w:t>. 2022;10(4):333-342. doi:10.5114/cipp.2022.114044 [poster ref 11]</w:t>
-      </w:r>
-    </w:p>
-    <w:p>
-      <w:pPr>
-        <w:spacing w:after="80"/>
-      </w:pPr>
-      <w:r>
-        <w:t xml:space="preserve">• </w:t>
-      </w:r>
-      <w:r>
-        <w:rPr>
-          <w:i w:val="0"/>
-        </w:rPr>
-        <w:t xml:space="preserve">Carroll S, Laufer MR, Thomas-Kowal P, Lossie AC, Moss-Morris R. From engulfment to enrichment: associations between illness representations, self-concept, and psychological adjustment in Mayer-Rokitansky-Küster-Hauser syndrome. </w:t>
-      </w:r>
-      <w:r>
-        <w:rPr>
-          <w:i/>
-        </w:rPr>
-        <w:t>J Pediatr Adolesc Gynecol</w:t>
-      </w:r>
-      <w:r>
-        <w:rPr>
-          <w:i w:val="0"/>
-        </w:rPr>
-        <w:t>. 2020;33(6):639-648. doi:10.1016/j.jpag.2020.07.006 [poster ref 13]</w:t>
-      </w:r>
-    </w:p>
-    <w:p>
-      <w:pPr>
-        <w:spacing w:after="80"/>
-      </w:pPr>
-      <w:r>
-        <w:t xml:space="preserve">• </w:t>
-      </w:r>
-      <w:r>
-        <w:rPr>
-          <w:i w:val="0"/>
-        </w:rPr>
-        <w:t xml:space="preserve">Chen N, Song S, Duan Y, et al. Study on depressive symptoms in patients with Mayer-Rokitansky-Küster-Hauser syndrome: an analysis of 141 cases. </w:t>
-      </w:r>
-      <w:r>
-        <w:rPr>
-          <w:i/>
-        </w:rPr>
-        <w:t>Orphanet J Rare Dis</w:t>
-      </w:r>
-      <w:r>
-        <w:rPr>
-          <w:i w:val="0"/>
-        </w:rPr>
-        <w:t>. 2020;15(1):121. doi:10.1186/s13023-020-01405-9 [poster ref 14]</w:t>
-      </w:r>
-    </w:p>
-    <w:p>
-      <w:pPr>
-        <w:spacing w:after="80"/>
-      </w:pPr>
-      <w:r>
-        <w:t xml:space="preserve">• </w:t>
+        <w:t xml:space="preserve">20. </w:t>
       </w:r>
       <w:r>
         <w:rPr>
@@ -644,7 +535,7 @@
         <w:spacing w:after="80"/>
       </w:pPr>
       <w:r>
-        <w:t xml:space="preserve">• </w:t>
+        <w:t xml:space="preserve">21. </w:t>
       </w:r>
       <w:r>
         <w:rPr>
@@ -670,7 +561,7 @@
         <w:spacing w:after="80"/>
       </w:pPr>
       <w:r>
-        <w:t xml:space="preserve">• </w:t>
+        <w:t xml:space="preserve">22. </w:t>
       </w:r>
       <w:r>
         <w:rPr>
@@ -696,7 +587,7 @@
         <w:spacing w:after="80"/>
       </w:pPr>
       <w:r>
-        <w:t xml:space="preserve">• </w:t>
+        <w:t xml:space="preserve">23. </w:t>
       </w:r>
       <w:r>
         <w:rPr>
@@ -722,7 +613,7 @@
         <w:spacing w:after="80"/>
       </w:pPr>
       <w:r>
-        <w:t xml:space="preserve">• </w:t>
+        <w:t xml:space="preserve">24. </w:t>
       </w:r>
       <w:r>
         <w:rPr>
@@ -748,7 +639,7 @@
         <w:spacing w:after="80"/>
       </w:pPr>
       <w:r>
-        <w:t xml:space="preserve">• </w:t>
+        <w:t xml:space="preserve">25. </w:t>
       </w:r>
       <w:r>
         <w:rPr>
@@ -774,7 +665,7 @@
         <w:spacing w:after="80"/>
       </w:pPr>
       <w:r>
-        <w:t xml:space="preserve">• </w:t>
+        <w:t xml:space="preserve">26. </w:t>
       </w:r>
       <w:r>
         <w:rPr>
@@ -800,7 +691,7 @@
         <w:spacing w:after="80"/>
       </w:pPr>
       <w:r>
-        <w:t xml:space="preserve">• </w:t>
+        <w:t xml:space="preserve">27. </w:t>
       </w:r>
       <w:r>
         <w:rPr>
@@ -826,7 +717,7 @@
         <w:spacing w:after="80"/>
       </w:pPr>
       <w:r>
-        <w:t xml:space="preserve">• </w:t>
+        <w:t xml:space="preserve">28. </w:t>
       </w:r>
       <w:r>
         <w:rPr>
@@ -852,7 +743,7 @@
         <w:spacing w:after="80"/>
       </w:pPr>
       <w:r>
-        <w:t xml:space="preserve">• </w:t>
+        <w:t xml:space="preserve">29. </w:t>
       </w:r>
       <w:r>
         <w:rPr>
@@ -878,59 +769,7 @@
         <w:spacing w:after="80"/>
       </w:pPr>
       <w:r>
-        <w:t xml:space="preserve">• </w:t>
-      </w:r>
-      <w:r>
-        <w:rPr>
-          <w:i w:val="0"/>
-        </w:rPr>
-        <w:t xml:space="preserve">Karpel L, Nicaise M, Carbonnel M, et al. Psychological evaluation of candidates for the uterus transplantation French trial. </w:t>
-      </w:r>
-      <w:r>
-        <w:rPr>
-          <w:i/>
-        </w:rPr>
-        <w:t>Acta Obstet Gynecol Scand</w:t>
-      </w:r>
-      <w:r>
-        <w:rPr>
-          <w:i w:val="0"/>
-        </w:rPr>
-        <w:t>. 2025;104(3):522-527. doi:10.1111/aogs.15004 [poster ref 16]</w:t>
-      </w:r>
-    </w:p>
-    <w:p>
-      <w:pPr>
-        <w:spacing w:after="80"/>
-      </w:pPr>
-      <w:r>
-        <w:t xml:space="preserve">• </w:t>
-      </w:r>
-      <w:r>
-        <w:rPr>
-          <w:i w:val="0"/>
-        </w:rPr>
-        <w:t xml:space="preserve">Khairudin KB, Nik Mhd Nor NS, Childs JF, et al. Prevalence of anxiety and depression in women with Mayer-Rokitansky-Küster-Hauser (MRKH) syndrome in Malaysia. </w:t>
-      </w:r>
-      <w:r>
-        <w:rPr>
-          <w:i/>
-        </w:rPr>
-        <w:t>J Pediatr Adolesc Gynecol</w:t>
-      </w:r>
-      <w:r>
-        <w:rPr>
-          <w:i w:val="0"/>
-        </w:rPr>
-        <w:t>. 2026;39(2):215-220. doi:10.1016/j.jpag.2025.11.005 [poster ref 15]</w:t>
-      </w:r>
-    </w:p>
-    <w:p>
-      <w:pPr>
-        <w:spacing w:after="80"/>
-      </w:pPr>
-      <w:r>
-        <w:t xml:space="preserve">• </w:t>
+        <w:t xml:space="preserve">30. </w:t>
       </w:r>
       <w:r>
         <w:rPr>
@@ -956,7 +795,7 @@
         <w:spacing w:after="80"/>
       </w:pPr>
       <w:r>
-        <w:t xml:space="preserve">• </w:t>
+        <w:t xml:space="preserve">31. </w:t>
       </w:r>
       <w:r>
         <w:rPr>
@@ -982,33 +821,7 @@
         <w:spacing w:after="80"/>
       </w:pPr>
       <w:r>
-        <w:t xml:space="preserve">• </w:t>
-      </w:r>
-      <w:r>
-        <w:rPr>
-          <w:i w:val="0"/>
-        </w:rPr>
-        <w:t xml:space="preserve">Lou S, Jensen AH, Vogel I, Trolle B, Herlin MK. Understanding the diagnostic odyssey of women with Mayer-Rokitansky-Küster-Hauser (MRKH) syndrome in Denmark: a qualitative interview study. </w:t>
-      </w:r>
-      <w:r>
-        <w:rPr>
-          <w:i/>
-        </w:rPr>
-        <w:t>J Pediatr Adolesc Gynecol</w:t>
-      </w:r>
-      <w:r>
-        <w:rPr>
-          <w:i w:val="0"/>
-        </w:rPr>
-        <w:t>. 2024;37(4):412-418. doi:10.1016/j.jpag.2024.03.003 [poster ref 12]</w:t>
-      </w:r>
-    </w:p>
-    <w:p>
-      <w:pPr>
-        <w:spacing w:after="80"/>
-      </w:pPr>
-      <w:r>
-        <w:t xml:space="preserve">• </w:t>
+        <w:t xml:space="preserve">32. </w:t>
       </w:r>
       <w:r>
         <w:rPr>
@@ -1034,7 +847,7 @@
         <w:spacing w:after="80"/>
       </w:pPr>
       <w:r>
-        <w:t xml:space="preserve">• </w:t>
+        <w:t xml:space="preserve">33. </w:t>
       </w:r>
       <w:r>
         <w:rPr>
@@ -1060,7 +873,7 @@
         <w:spacing w:after="80"/>
       </w:pPr>
       <w:r>
-        <w:t xml:space="preserve">• </w:t>
+        <w:t xml:space="preserve">34. </w:t>
       </w:r>
       <w:r>
         <w:rPr>
@@ -1086,7 +899,7 @@
         <w:spacing w:after="80"/>
       </w:pPr>
       <w:r>
-        <w:t xml:space="preserve">• </w:t>
+        <w:t xml:space="preserve">35. </w:t>
       </w:r>
       <w:r>
         <w:rPr>
@@ -1112,7 +925,7 @@
         <w:spacing w:after="80"/>
       </w:pPr>
       <w:r>
-        <w:t xml:space="preserve">• </w:t>
+        <w:t xml:space="preserve">36. </w:t>
       </w:r>
       <w:r>
         <w:rPr>
@@ -1138,7 +951,7 @@
         <w:spacing w:after="80"/>
       </w:pPr>
       <w:r>
-        <w:t xml:space="preserve">• </w:t>
+        <w:t xml:space="preserve">37. </w:t>
       </w:r>
       <w:r>
         <w:rPr>
@@ -1164,7 +977,7 @@
         <w:spacing w:after="80"/>
       </w:pPr>
       <w:r>
-        <w:t xml:space="preserve">• </w:t>
+        <w:t xml:space="preserve">38. </w:t>
       </w:r>
       <w:r>
         <w:rPr>
@@ -1190,7 +1003,7 @@
         <w:spacing w:after="80"/>
       </w:pPr>
       <w:r>
-        <w:t xml:space="preserve">• </w:t>
+        <w:t xml:space="preserve">39. </w:t>
       </w:r>
       <w:r>
         <w:rPr>
@@ -1216,7 +1029,7 @@
         <w:spacing w:after="80"/>
       </w:pPr>
       <w:r>
-        <w:t xml:space="preserve">• </w:t>
+        <w:t xml:space="preserve">40. </w:t>
       </w:r>
       <w:r>
         <w:rPr>
@@ -1242,33 +1055,7 @@
         <w:spacing w:after="80"/>
       </w:pPr>
       <w:r>
-        <w:t xml:space="preserve">• </w:t>
-      </w:r>
-      <w:r>
-        <w:rPr>
-          <w:i w:val="0"/>
-        </w:rPr>
-        <w:t xml:space="preserve">Shao S, Wang X, Lei X, Hua K, Zhang Y. Psychological intervention in women with Mayer-Rokitansky-Küster-Hauser syndrome after artificial vaginoplasty: a prospective study. </w:t>
-      </w:r>
-      <w:r>
-        <w:rPr>
-          <w:i/>
-        </w:rPr>
-        <w:t>Int Urogynecol J</w:t>
-      </w:r>
-      <w:r>
-        <w:rPr>
-          <w:i w:val="0"/>
-        </w:rPr>
-        <w:t>. 2022;33(3):723-729. doi:10.1007/s00192-022-05075-y [poster ref 17]</w:t>
-      </w:r>
-    </w:p>
-    <w:p>
-      <w:pPr>
-        <w:spacing w:after="80"/>
-      </w:pPr>
-      <w:r>
-        <w:t xml:space="preserve">• </w:t>
+        <w:t xml:space="preserve">41. </w:t>
       </w:r>
       <w:r>
         <w:rPr>
@@ -1294,7 +1081,7 @@
         <w:spacing w:after="80"/>
       </w:pPr>
       <w:r>
-        <w:t xml:space="preserve">• </w:t>
+        <w:t xml:space="preserve">42. </w:t>
       </w:r>
       <w:r>
         <w:rPr>
@@ -1320,7 +1107,7 @@
         <w:spacing w:after="80"/>
       </w:pPr>
       <w:r>
-        <w:t xml:space="preserve">• </w:t>
+        <w:t xml:space="preserve">43. </w:t>
       </w:r>
       <w:r>
         <w:rPr>
@@ -1346,7 +1133,7 @@
         <w:spacing w:after="80"/>
       </w:pPr>
       <w:r>
-        <w:t xml:space="preserve">• </w:t>
+        <w:t xml:space="preserve">44. </w:t>
       </w:r>
       <w:r>
         <w:rPr>
@@ -1372,67 +1159,7 @@
         <w:spacing w:after="80"/>
       </w:pPr>
       <w:r>
-        <w:t xml:space="preserve">• </w:t>
-      </w:r>
-      <w:r>
-        <w:rPr>
-          <w:i w:val="0"/>
-        </w:rPr>
-        <w:t xml:space="preserve">Vosoughi N, Maasoumi R, Haeri Mehrizi AA, Ghanbari Z. The effect of psychosexual education on promoting sexual function, genital self-image, and sexual distress among women with Rokitansky syndrome: a randomized controlled clinical trial. </w:t>
-      </w:r>
-      <w:r>
-        <w:rPr>
-          <w:i/>
-        </w:rPr>
-        <w:t>J Pediatr Adolesc Gynecol</w:t>
-      </w:r>
-      <w:r>
-        <w:rPr>
-          <w:i w:val="0"/>
-        </w:rPr>
-        <w:t>. 2022;35(1):73-81. doi:10.1016/j.jpag.2021.06.008 [poster ref 18]</w:t>
-      </w:r>
-    </w:p>
-    <w:p>
-      <w:pPr>
-        <w:spacing w:after="80"/>
-      </w:pPr>
-      <w:r>
-        <w:t xml:space="preserve">• </w:t>
-      </w:r>
-      <w:r>
-        <w:rPr>
-          <w:i w:val="0"/>
-        </w:rPr>
-        <w:t xml:space="preserve">Weijenborg PTM, Kluivers KB, Dessens AB, ten Kate-Booij MJ, Both S. Sexual functioning, sexual esteem, genital self-image and psychological and relational functioning in women with Mayer-Rokitansky-Küster-Hauser syndrome: a case-control study. </w:t>
-      </w:r>
-      <w:r>
-        <w:rPr>
-          <w:i/>
-        </w:rPr>
-        <w:t>Hum Reprod</w:t>
-      </w:r>
-      <w:r>
-        <w:rPr>
-          <w:i w:val="0"/>
-        </w:rPr>
-        <w:t>. 2019;34(9):1661-1673. doi:10.1093/humrep/dez130 [poster ref 10]</w:t>
-      </w:r>
-    </w:p>
-    <w:p>
-      <w:pPr>
-        <w:pStyle w:val="Heading2"/>
-      </w:pPr>
-      <w:r>
-        <w:t>C. Additional background references (manuscript)</w:t>
-      </w:r>
-    </w:p>
-    <w:p>
-      <w:pPr>
-        <w:spacing w:after="80"/>
-      </w:pPr>
-      <w:r>
-        <w:t xml:space="preserve">• </w:t>
+        <w:t xml:space="preserve">45. </w:t>
       </w:r>
       <w:r>
         <w:rPr>
@@ -1458,7 +1185,7 @@
         <w:spacing w:after="80"/>
       </w:pPr>
       <w:r>
-        <w:t xml:space="preserve">• </w:t>
+        <w:t xml:space="preserve">46. </w:t>
       </w:r>
       <w:r>
         <w:rPr>
@@ -1484,7 +1211,7 @@
         <w:spacing w:after="80"/>
       </w:pPr>
       <w:r>
-        <w:t xml:space="preserve">• </w:t>
+        <w:t xml:space="preserve">47. </w:t>
       </w:r>
       <w:r>
         <w:rPr>
@@ -1510,7 +1237,7 @@
         <w:spacing w:after="80"/>
       </w:pPr>
       <w:r>
-        <w:t xml:space="preserve">• </w:t>
+        <w:t xml:space="preserve">48. </w:t>
       </w:r>
       <w:r>
         <w:rPr>
@@ -1536,7 +1263,7 @@
         <w:spacing w:after="80"/>
       </w:pPr>
       <w:r>
-        <w:t xml:space="preserve">• </w:t>
+        <w:t xml:space="preserve">49. </w:t>
       </w:r>
       <w:r>
         <w:rPr>
@@ -1562,7 +1289,7 @@
         <w:spacing w:after="80"/>
       </w:pPr>
       <w:r>
-        <w:t xml:space="preserve">• </w:t>
+        <w:t xml:space="preserve">50. </w:t>
       </w:r>
       <w:r>
         <w:rPr>

</xml_diff>

<commit_message>
Reference list: AMA double spacing, 12 pt
Co-Authored-By: Claude Opus 5.5 <noreply@anthropic.com>
Claude-Session: https://claude.ai/code/session_01N468nYR7vy45HpujgUezn5
</commit_message>
<xml_diff>
--- a/poster/Poster_Full_Reference_List.docx
+++ b/poster/Poster_Full_Reference_List.docx
@@ -12,7 +12,7 @@
     </w:p>
     <w:p>
       <w:pPr>
-        <w:spacing w:after="80"/>
+        <w:spacing w:after="0"/>
       </w:pPr>
       <w:r>
         <w:t xml:space="preserve">1. </w:t>
@@ -38,7 +38,7 @@
     </w:p>
     <w:p>
       <w:pPr>
-        <w:spacing w:after="80"/>
+        <w:spacing w:after="0"/>
       </w:pPr>
       <w:r>
         <w:t xml:space="preserve">2. </w:t>
@@ -64,7 +64,7 @@
     </w:p>
     <w:p>
       <w:pPr>
-        <w:spacing w:after="80"/>
+        <w:spacing w:after="0"/>
       </w:pPr>
       <w:r>
         <w:t xml:space="preserve">3. </w:t>
@@ -90,7 +90,7 @@
     </w:p>
     <w:p>
       <w:pPr>
-        <w:spacing w:after="80"/>
+        <w:spacing w:after="0"/>
       </w:pPr>
       <w:r>
         <w:t xml:space="preserve">4. </w:t>
@@ -116,7 +116,7 @@
     </w:p>
     <w:p>
       <w:pPr>
-        <w:spacing w:after="80"/>
+        <w:spacing w:after="0"/>
       </w:pPr>
       <w:r>
         <w:t xml:space="preserve">5. </w:t>
@@ -142,7 +142,7 @@
     </w:p>
     <w:p>
       <w:pPr>
-        <w:spacing w:after="80"/>
+        <w:spacing w:after="0"/>
       </w:pPr>
       <w:r>
         <w:t xml:space="preserve">6. </w:t>
@@ -168,7 +168,7 @@
     </w:p>
     <w:p>
       <w:pPr>
-        <w:spacing w:after="80"/>
+        <w:spacing w:after="0"/>
       </w:pPr>
       <w:r>
         <w:t xml:space="preserve">7. </w:t>
@@ -194,7 +194,7 @@
     </w:p>
     <w:p>
       <w:pPr>
-        <w:spacing w:after="80"/>
+        <w:spacing w:after="0"/>
       </w:pPr>
       <w:r>
         <w:t xml:space="preserve">8. </w:t>
@@ -220,7 +220,7 @@
     </w:p>
     <w:p>
       <w:pPr>
-        <w:spacing w:after="80"/>
+        <w:spacing w:after="0"/>
       </w:pPr>
       <w:r>
         <w:t xml:space="preserve">9. </w:t>
@@ -246,7 +246,7 @@
     </w:p>
     <w:p>
       <w:pPr>
-        <w:spacing w:after="80"/>
+        <w:spacing w:after="0"/>
       </w:pPr>
       <w:r>
         <w:t xml:space="preserve">10. </w:t>
@@ -272,7 +272,7 @@
     </w:p>
     <w:p>
       <w:pPr>
-        <w:spacing w:after="80"/>
+        <w:spacing w:after="0"/>
       </w:pPr>
       <w:r>
         <w:t xml:space="preserve">11. </w:t>
@@ -298,7 +298,7 @@
     </w:p>
     <w:p>
       <w:pPr>
-        <w:spacing w:after="80"/>
+        <w:spacing w:after="0"/>
       </w:pPr>
       <w:r>
         <w:t xml:space="preserve">12. </w:t>
@@ -324,7 +324,7 @@
     </w:p>
     <w:p>
       <w:pPr>
-        <w:spacing w:after="80"/>
+        <w:spacing w:after="0"/>
       </w:pPr>
       <w:r>
         <w:t xml:space="preserve">13. </w:t>
@@ -350,7 +350,7 @@
     </w:p>
     <w:p>
       <w:pPr>
-        <w:spacing w:after="80"/>
+        <w:spacing w:after="0"/>
       </w:pPr>
       <w:r>
         <w:t xml:space="preserve">14. </w:t>
@@ -376,7 +376,7 @@
     </w:p>
     <w:p>
       <w:pPr>
-        <w:spacing w:after="80"/>
+        <w:spacing w:after="0"/>
       </w:pPr>
       <w:r>
         <w:t xml:space="preserve">15. </w:t>
@@ -402,7 +402,7 @@
     </w:p>
     <w:p>
       <w:pPr>
-        <w:spacing w:after="80"/>
+        <w:spacing w:after="0"/>
       </w:pPr>
       <w:r>
         <w:t xml:space="preserve">16. </w:t>
@@ -428,7 +428,7 @@
     </w:p>
     <w:p>
       <w:pPr>
-        <w:spacing w:after="80"/>
+        <w:spacing w:after="0"/>
       </w:pPr>
       <w:r>
         <w:t xml:space="preserve">17. </w:t>
@@ -454,7 +454,7 @@
     </w:p>
     <w:p>
       <w:pPr>
-        <w:spacing w:after="80"/>
+        <w:spacing w:after="0"/>
       </w:pPr>
       <w:r>
         <w:t xml:space="preserve">18. </w:t>
@@ -480,7 +480,7 @@
     </w:p>
     <w:p>
       <w:pPr>
-        <w:spacing w:after="80"/>
+        <w:spacing w:after="0"/>
       </w:pPr>
       <w:r>
         <w:t xml:space="preserve">19. </w:t>
@@ -506,7 +506,7 @@
     </w:p>
     <w:p>
       <w:pPr>
-        <w:spacing w:after="80"/>
+        <w:spacing w:after="0"/>
       </w:pPr>
       <w:r>
         <w:t xml:space="preserve">20. </w:t>
@@ -532,7 +532,7 @@
     </w:p>
     <w:p>
       <w:pPr>
-        <w:spacing w:after="80"/>
+        <w:spacing w:after="0"/>
       </w:pPr>
       <w:r>
         <w:t xml:space="preserve">21. </w:t>
@@ -558,7 +558,7 @@
     </w:p>
     <w:p>
       <w:pPr>
-        <w:spacing w:after="80"/>
+        <w:spacing w:after="0"/>
       </w:pPr>
       <w:r>
         <w:t xml:space="preserve">22. </w:t>
@@ -584,7 +584,7 @@
     </w:p>
     <w:p>
       <w:pPr>
-        <w:spacing w:after="80"/>
+        <w:spacing w:after="0"/>
       </w:pPr>
       <w:r>
         <w:t xml:space="preserve">23. </w:t>
@@ -610,7 +610,7 @@
     </w:p>
     <w:p>
       <w:pPr>
-        <w:spacing w:after="80"/>
+        <w:spacing w:after="0"/>
       </w:pPr>
       <w:r>
         <w:t xml:space="preserve">24. </w:t>
@@ -636,7 +636,7 @@
     </w:p>
     <w:p>
       <w:pPr>
-        <w:spacing w:after="80"/>
+        <w:spacing w:after="0"/>
       </w:pPr>
       <w:r>
         <w:t xml:space="preserve">25. </w:t>
@@ -662,7 +662,7 @@
     </w:p>
     <w:p>
       <w:pPr>
-        <w:spacing w:after="80"/>
+        <w:spacing w:after="0"/>
       </w:pPr>
       <w:r>
         <w:t xml:space="preserve">26. </w:t>
@@ -688,7 +688,7 @@
     </w:p>
     <w:p>
       <w:pPr>
-        <w:spacing w:after="80"/>
+        <w:spacing w:after="0"/>
       </w:pPr>
       <w:r>
         <w:t xml:space="preserve">27. </w:t>
@@ -714,7 +714,7 @@
     </w:p>
     <w:p>
       <w:pPr>
-        <w:spacing w:after="80"/>
+        <w:spacing w:after="0"/>
       </w:pPr>
       <w:r>
         <w:t xml:space="preserve">28. </w:t>
@@ -740,7 +740,7 @@
     </w:p>
     <w:p>
       <w:pPr>
-        <w:spacing w:after="80"/>
+        <w:spacing w:after="0"/>
       </w:pPr>
       <w:r>
         <w:t xml:space="preserve">29. </w:t>
@@ -766,7 +766,7 @@
     </w:p>
     <w:p>
       <w:pPr>
-        <w:spacing w:after="80"/>
+        <w:spacing w:after="0"/>
       </w:pPr>
       <w:r>
         <w:t xml:space="preserve">30. </w:t>
@@ -792,7 +792,7 @@
     </w:p>
     <w:p>
       <w:pPr>
-        <w:spacing w:after="80"/>
+        <w:spacing w:after="0"/>
       </w:pPr>
       <w:r>
         <w:t xml:space="preserve">31. </w:t>
@@ -818,7 +818,7 @@
     </w:p>
     <w:p>
       <w:pPr>
-        <w:spacing w:after="80"/>
+        <w:spacing w:after="0"/>
       </w:pPr>
       <w:r>
         <w:t xml:space="preserve">32. </w:t>
@@ -844,7 +844,7 @@
     </w:p>
     <w:p>
       <w:pPr>
-        <w:spacing w:after="80"/>
+        <w:spacing w:after="0"/>
       </w:pPr>
       <w:r>
         <w:t xml:space="preserve">33. </w:t>
@@ -870,7 +870,7 @@
     </w:p>
     <w:p>
       <w:pPr>
-        <w:spacing w:after="80"/>
+        <w:spacing w:after="0"/>
       </w:pPr>
       <w:r>
         <w:t xml:space="preserve">34. </w:t>
@@ -896,7 +896,7 @@
     </w:p>
     <w:p>
       <w:pPr>
-        <w:spacing w:after="80"/>
+        <w:spacing w:after="0"/>
       </w:pPr>
       <w:r>
         <w:t xml:space="preserve">35. </w:t>
@@ -922,7 +922,7 @@
     </w:p>
     <w:p>
       <w:pPr>
-        <w:spacing w:after="80"/>
+        <w:spacing w:after="0"/>
       </w:pPr>
       <w:r>
         <w:t xml:space="preserve">36. </w:t>
@@ -948,7 +948,7 @@
     </w:p>
     <w:p>
       <w:pPr>
-        <w:spacing w:after="80"/>
+        <w:spacing w:after="0"/>
       </w:pPr>
       <w:r>
         <w:t xml:space="preserve">37. </w:t>
@@ -974,7 +974,7 @@
     </w:p>
     <w:p>
       <w:pPr>
-        <w:spacing w:after="80"/>
+        <w:spacing w:after="0"/>
       </w:pPr>
       <w:r>
         <w:t xml:space="preserve">38. </w:t>
@@ -1000,7 +1000,7 @@
     </w:p>
     <w:p>
       <w:pPr>
-        <w:spacing w:after="80"/>
+        <w:spacing w:after="0"/>
       </w:pPr>
       <w:r>
         <w:t xml:space="preserve">39. </w:t>
@@ -1026,7 +1026,7 @@
     </w:p>
     <w:p>
       <w:pPr>
-        <w:spacing w:after="80"/>
+        <w:spacing w:after="0"/>
       </w:pPr>
       <w:r>
         <w:t xml:space="preserve">40. </w:t>
@@ -1052,7 +1052,7 @@
     </w:p>
     <w:p>
       <w:pPr>
-        <w:spacing w:after="80"/>
+        <w:spacing w:after="0"/>
       </w:pPr>
       <w:r>
         <w:t xml:space="preserve">41. </w:t>
@@ -1078,7 +1078,7 @@
     </w:p>
     <w:p>
       <w:pPr>
-        <w:spacing w:after="80"/>
+        <w:spacing w:after="0"/>
       </w:pPr>
       <w:r>
         <w:t xml:space="preserve">42. </w:t>
@@ -1104,7 +1104,7 @@
     </w:p>
     <w:p>
       <w:pPr>
-        <w:spacing w:after="80"/>
+        <w:spacing w:after="0"/>
       </w:pPr>
       <w:r>
         <w:t xml:space="preserve">43. </w:t>
@@ -1130,7 +1130,7 @@
     </w:p>
     <w:p>
       <w:pPr>
-        <w:spacing w:after="80"/>
+        <w:spacing w:after="0"/>
       </w:pPr>
       <w:r>
         <w:t xml:space="preserve">44. </w:t>
@@ -1156,7 +1156,7 @@
     </w:p>
     <w:p>
       <w:pPr>
-        <w:spacing w:after="80"/>
+        <w:spacing w:after="0"/>
       </w:pPr>
       <w:r>
         <w:t xml:space="preserve">45. </w:t>
@@ -1182,7 +1182,7 @@
     </w:p>
     <w:p>
       <w:pPr>
-        <w:spacing w:after="80"/>
+        <w:spacing w:after="0"/>
       </w:pPr>
       <w:r>
         <w:t xml:space="preserve">46. </w:t>
@@ -1208,7 +1208,7 @@
     </w:p>
     <w:p>
       <w:pPr>
-        <w:spacing w:after="80"/>
+        <w:spacing w:after="0"/>
       </w:pPr>
       <w:r>
         <w:t xml:space="preserve">47. </w:t>
@@ -1234,7 +1234,7 @@
     </w:p>
     <w:p>
       <w:pPr>
-        <w:spacing w:after="80"/>
+        <w:spacing w:after="0"/>
       </w:pPr>
       <w:r>
         <w:t xml:space="preserve">48. </w:t>
@@ -1260,7 +1260,7 @@
     </w:p>
     <w:p>
       <w:pPr>
-        <w:spacing w:after="80"/>
+        <w:spacing w:after="0"/>
       </w:pPr>
       <w:r>
         <w:t xml:space="preserve">49. </w:t>
@@ -1286,7 +1286,7 @@
     </w:p>
     <w:p>
       <w:pPr>
-        <w:spacing w:after="80"/>
+        <w:spacing w:after="0"/>
       </w:pPr>
       <w:r>
         <w:t xml:space="preserve">50. </w:t>
@@ -1683,9 +1683,12 @@
     <w:name w:val="Normal"/>
     <w:qFormat/>
     <w:rsid w:val="00FC693F"/>
+    <w:pPr>
+      <w:spacing w:line="480" w:lineRule="auto"/>
+    </w:pPr>
     <w:rPr>
       <w:rFonts w:ascii="Times New Roman" w:hAnsi="Times New Roman"/>
-      <w:sz w:val="22"/>
+      <w:sz w:val="24"/>
     </w:rPr>
   </w:style>
   <w:style w:type="paragraph" w:styleId="Header">

</xml_diff>